<commit_message>
OPD 6 Doc Done
</commit_message>
<xml_diff>
--- a/Les-6/C practicum les 6.docx
+++ b/Les-6/C practicum les 6.docx
@@ -3358,6 +3358,7 @@
       </w:pPr>
       <w:r>
         <w:t xml:space="preserve">}</w:t>
+        <w:br/>
       </w:r>
       <w:r/>
       <w:r/>
@@ -3711,80 +3712,4308 @@
     </w:p>
     <w:p>
       <w:pPr>
-        <w:pStyle w:val="629"/>
-        <w:pBdr/>
-        <w:spacing/>
-        <w:ind/>
-        <w:rPr/>
-      </w:pPr>
-      <w:r/>
-      <w:r/>
-    </w:p>
-    <w:p>
-      <w:pPr>
-        <w:pBdr/>
-        <w:spacing/>
-        <w:ind/>
-        <w:rPr/>
-      </w:pPr>
-      <w:r>
-        <w:t xml:space="preserve">Opgave 3: Optioneel</w:t>
-      </w:r>
-      <w:r/>
-    </w:p>
-    <w:p>
-      <w:pPr>
-        <w:pBdr/>
-        <w:spacing/>
-        <w:ind/>
-        <w:rPr/>
-      </w:pPr>
-      <w:r>
-        <w:t xml:space="preserve">Maak dezelfde opgaves als de vo</w:t>
-      </w:r>
-      <w:r>
-        <w:t xml:space="preserve">rige </w:t>
-      </w:r>
-      <w:r>
-        <w:t xml:space="preserve">opgave. De </w:t>
-      </w:r>
-      <w:r>
-        <w:t xml:space="preserve">linked</w:t>
-      </w:r>
-      <w:r>
-        <w:t xml:space="preserve"> list bevat nu alleen geen getal</w:t>
-      </w:r>
-      <w:r>
-        <w:t xml:space="preserve">len</w:t>
-      </w:r>
-      <w:r>
-        <w:t xml:space="preserve"> maar </w:t>
-      </w:r>
-      <w:r>
-        <w:t xml:space="preserve">een </w:t>
-      </w:r>
-      <w:r>
-        <w:t xml:space="preserve">bepaalde </w:t>
-      </w:r>
-      <w:r>
-        <w:t xml:space="preserve">(willekeurige) </w:t>
-      </w:r>
-      <w:r>
-        <w:t xml:space="preserve">struct</w:t>
-      </w:r>
-      <w:r>
-        <w:t xml:space="preserve">.</w:t>
-      </w:r>
-      <w:r/>
-    </w:p>
-    <w:p>
-      <w:pPr>
-        <w:pStyle w:val="629"/>
-        <w:pBdr/>
-        <w:spacing/>
-        <w:ind/>
-        <w:rPr/>
-      </w:pPr>
+        <w:pStyle w:val="33"/>
+        <w:pBdr/>
+        <w:spacing/>
+        <w:ind/>
+        <w:rPr/>
+      </w:pPr>
+      <w:r>
+        <w:t xml:space="preserve">#include &lt;stdio.h&gt;</w:t>
+      </w:r>
+      <w:r/>
+    </w:p>
+    <w:p>
+      <w:pPr>
+        <w:pStyle w:val="33"/>
+        <w:pBdr/>
+        <w:spacing/>
+        <w:ind/>
+        <w:rPr/>
+      </w:pPr>
+      <w:r>
+        <w:t xml:space="preserve">#include &lt;stdlib.h&gt;</w:t>
+      </w:r>
+      <w:r/>
+    </w:p>
+    <w:p>
+      <w:pPr>
+        <w:pStyle w:val="33"/>
+        <w:pBdr/>
+        <w:spacing/>
+        <w:ind/>
+        <w:rPr/>
+      </w:pPr>
+      <w:r/>
+      <w:r/>
+    </w:p>
+    <w:p>
+      <w:pPr>
+        <w:pStyle w:val="33"/>
+        <w:pBdr/>
+        <w:spacing/>
+        <w:ind/>
+        <w:rPr/>
+      </w:pPr>
+      <w:r>
+        <w:t xml:space="preserve">// ========== STRUCT DEFINITIE ==========</w:t>
+      </w:r>
+      <w:r/>
+    </w:p>
+    <w:p>
+      <w:pPr>
+        <w:pStyle w:val="33"/>
+        <w:pBdr/>
+        <w:spacing/>
+        <w:ind/>
+        <w:rPr/>
+      </w:pPr>
+      <w:r>
+        <w:t xml:space="preserve">// Een node in de linked list</w:t>
+      </w:r>
+      <w:r/>
+    </w:p>
+    <w:p>
+      <w:pPr>
+        <w:pStyle w:val="33"/>
+        <w:pBdr/>
+        <w:spacing/>
+        <w:ind/>
+        <w:rPr/>
+      </w:pPr>
+      <w:r>
+        <w:t xml:space="preserve">struct node {</w:t>
+      </w:r>
+      <w:r/>
+    </w:p>
+    <w:p>
+      <w:pPr>
+        <w:pStyle w:val="33"/>
+        <w:pBdr/>
+        <w:spacing/>
+        <w:ind/>
+        <w:rPr/>
+      </w:pPr>
+      <w:r>
+        <w:t xml:space="preserve">    int data;</w:t>
+      </w:r>
+      <w:r/>
+    </w:p>
+    <w:p>
+      <w:pPr>
+        <w:pStyle w:val="33"/>
+        <w:pBdr/>
+        <w:spacing/>
+        <w:ind/>
+        <w:rPr/>
+      </w:pPr>
+      <w:r>
+        <w:t xml:space="preserve">    struct node* next;</w:t>
+      </w:r>
+      <w:r/>
+    </w:p>
+    <w:p>
+      <w:pPr>
+        <w:pStyle w:val="33"/>
+        <w:pBdr/>
+        <w:spacing/>
+        <w:ind/>
+        <w:rPr/>
+      </w:pPr>
+      <w:r>
+        <w:t xml:space="preserve">};</w:t>
+      </w:r>
+      <w:r/>
+    </w:p>
+    <w:p>
+      <w:pPr>
+        <w:pStyle w:val="33"/>
+        <w:pBdr/>
+        <w:spacing/>
+        <w:ind/>
+        <w:rPr/>
+      </w:pPr>
+      <w:r/>
+      <w:r/>
+    </w:p>
+    <w:p>
+      <w:pPr>
+        <w:pStyle w:val="33"/>
+        <w:pBdr/>
+        <w:spacing/>
+        <w:ind/>
+        <w:rPr/>
+      </w:pPr>
+      <w:r>
+        <w:t xml:space="preserve">// ========== FUNCTIE a) ==========</w:t>
+      </w:r>
+      <w:r/>
+    </w:p>
+    <w:p>
+      <w:pPr>
+        <w:pStyle w:val="33"/>
+        <w:pBdr/>
+        <w:spacing/>
+        <w:ind/>
+        <w:rPr/>
+      </w:pPr>
+      <w:r>
+        <w:t xml:space="preserve">// Zet een array om naar een linked list (kopie van data)</w:t>
+      </w:r>
+      <w:r/>
+    </w:p>
+    <w:p>
+      <w:pPr>
+        <w:pStyle w:val="33"/>
+        <w:pBdr/>
+        <w:spacing/>
+        <w:ind/>
+        <w:rPr/>
+      </w:pPr>
+      <w:r>
+        <w:t xml:space="preserve">struct node* arrayToLinkedList(int array[], int size) {</w:t>
+      </w:r>
+      <w:r/>
+    </w:p>
+    <w:p>
+      <w:pPr>
+        <w:pStyle w:val="33"/>
+        <w:pBdr/>
+        <w:spacing/>
+        <w:ind/>
+        <w:rPr/>
+      </w:pPr>
+      <w:r>
+        <w:t xml:space="preserve">    if (size == 0) {</w:t>
+      </w:r>
+      <w:r/>
+    </w:p>
+    <w:p>
+      <w:pPr>
+        <w:pStyle w:val="33"/>
+        <w:pBdr/>
+        <w:spacing/>
+        <w:ind/>
+        <w:rPr/>
+      </w:pPr>
+      <w:r>
+        <w:t xml:space="preserve">        return NULL;</w:t>
+      </w:r>
+      <w:r/>
+    </w:p>
+    <w:p>
+      <w:pPr>
+        <w:pStyle w:val="33"/>
+        <w:pBdr/>
+        <w:spacing/>
+        <w:ind/>
+        <w:rPr/>
+      </w:pPr>
+      <w:r>
+        <w:t xml:space="preserve">    }</w:t>
+      </w:r>
+      <w:r/>
+    </w:p>
+    <w:p>
+      <w:pPr>
+        <w:pStyle w:val="33"/>
+        <w:pBdr/>
+        <w:spacing/>
+        <w:ind/>
+        <w:rPr/>
+      </w:pPr>
+      <w:r>
+        <w:t xml:space="preserve">    </w:t>
+      </w:r>
+      <w:r/>
+    </w:p>
+    <w:p>
+      <w:pPr>
+        <w:pStyle w:val="33"/>
+        <w:pBdr/>
+        <w:spacing/>
+        <w:ind/>
+        <w:rPr/>
+      </w:pPr>
+      <w:r>
+        <w:t xml:space="preserve">    // Maak de eerste node</w:t>
+      </w:r>
+      <w:r/>
+    </w:p>
+    <w:p>
+      <w:pPr>
+        <w:pStyle w:val="33"/>
+        <w:pBdr/>
+        <w:spacing/>
+        <w:ind/>
+        <w:rPr/>
+      </w:pPr>
+      <w:r>
+        <w:t xml:space="preserve">    struct node* head = (struct node*)malloc(sizeof(struct node));</w:t>
+      </w:r>
+      <w:r/>
+    </w:p>
+    <w:p>
+      <w:pPr>
+        <w:pStyle w:val="33"/>
+        <w:pBdr/>
+        <w:spacing/>
+        <w:ind/>
+        <w:rPr/>
+      </w:pPr>
+      <w:r>
+        <w:t xml:space="preserve">    head-&gt;data = array[0];</w:t>
+      </w:r>
+      <w:r/>
+    </w:p>
+    <w:p>
+      <w:pPr>
+        <w:pStyle w:val="33"/>
+        <w:pBdr/>
+        <w:spacing/>
+        <w:ind/>
+        <w:rPr/>
+      </w:pPr>
+      <w:r>
+        <w:t xml:space="preserve">    head-&gt;next = NULL;</w:t>
+      </w:r>
+      <w:r/>
+    </w:p>
+    <w:p>
+      <w:pPr>
+        <w:pStyle w:val="33"/>
+        <w:pBdr/>
+        <w:spacing/>
+        <w:ind/>
+        <w:rPr/>
+      </w:pPr>
+      <w:r>
+        <w:t xml:space="preserve">    </w:t>
+      </w:r>
+      <w:r/>
+    </w:p>
+    <w:p>
+      <w:pPr>
+        <w:pStyle w:val="33"/>
+        <w:pBdr/>
+        <w:spacing/>
+        <w:ind/>
+        <w:rPr/>
+      </w:pPr>
+      <w:r>
+        <w:t xml:space="preserve">    // Maak de rest van de nodes</w:t>
+      </w:r>
+      <w:r/>
+    </w:p>
+    <w:p>
+      <w:pPr>
+        <w:pStyle w:val="33"/>
+        <w:pBdr/>
+        <w:spacing/>
+        <w:ind/>
+        <w:rPr/>
+      </w:pPr>
+      <w:r>
+        <w:t xml:space="preserve">    struct node* current = head;</w:t>
+      </w:r>
+      <w:r/>
+    </w:p>
+    <w:p>
+      <w:pPr>
+        <w:pStyle w:val="33"/>
+        <w:pBdr/>
+        <w:spacing/>
+        <w:ind/>
+        <w:rPr/>
+      </w:pPr>
+      <w:r>
+        <w:t xml:space="preserve">    for (int i = 1; i &lt; size; i++) {</w:t>
+      </w:r>
+      <w:r/>
+    </w:p>
+    <w:p>
+      <w:pPr>
+        <w:pStyle w:val="33"/>
+        <w:pBdr/>
+        <w:spacing/>
+        <w:ind/>
+        <w:rPr/>
+      </w:pPr>
+      <w:r>
+        <w:t xml:space="preserve">        struct node* newNode = (struct node*)malloc(sizeof(struct node));</w:t>
+      </w:r>
+      <w:r/>
+    </w:p>
+    <w:p>
+      <w:pPr>
+        <w:pStyle w:val="33"/>
+        <w:pBdr/>
+        <w:spacing/>
+        <w:ind/>
+        <w:rPr/>
+      </w:pPr>
+      <w:r>
+        <w:t xml:space="preserve">        newNode-&gt;data = array[i];</w:t>
+      </w:r>
+      <w:r/>
+    </w:p>
+    <w:p>
+      <w:pPr>
+        <w:pStyle w:val="33"/>
+        <w:pBdr/>
+        <w:spacing/>
+        <w:ind/>
+        <w:rPr/>
+      </w:pPr>
+      <w:r>
+        <w:t xml:space="preserve">        newNode-&gt;next = NULL;</w:t>
+      </w:r>
+      <w:r/>
+    </w:p>
+    <w:p>
+      <w:pPr>
+        <w:pStyle w:val="33"/>
+        <w:pBdr/>
+        <w:spacing/>
+        <w:ind/>
+        <w:rPr/>
+      </w:pPr>
+      <w:r>
+        <w:t xml:space="preserve">        </w:t>
+      </w:r>
+      <w:r/>
+    </w:p>
+    <w:p>
+      <w:pPr>
+        <w:pStyle w:val="33"/>
+        <w:pBdr/>
+        <w:spacing/>
+        <w:ind/>
+        <w:rPr/>
+      </w:pPr>
+      <w:r>
+        <w:t xml:space="preserve">        current-&gt;next = newNode;</w:t>
+      </w:r>
+      <w:r/>
+    </w:p>
+    <w:p>
+      <w:pPr>
+        <w:pStyle w:val="33"/>
+        <w:pBdr/>
+        <w:spacing/>
+        <w:ind/>
+        <w:rPr/>
+      </w:pPr>
+      <w:r>
+        <w:t xml:space="preserve">        current = newNode;</w:t>
+      </w:r>
+      <w:r/>
+    </w:p>
+    <w:p>
+      <w:pPr>
+        <w:pStyle w:val="33"/>
+        <w:pBdr/>
+        <w:spacing/>
+        <w:ind/>
+        <w:rPr/>
+      </w:pPr>
+      <w:r>
+        <w:t xml:space="preserve">    }</w:t>
+      </w:r>
+      <w:r/>
+    </w:p>
+    <w:p>
+      <w:pPr>
+        <w:pStyle w:val="33"/>
+        <w:pBdr/>
+        <w:spacing/>
+        <w:ind/>
+        <w:rPr/>
+      </w:pPr>
+      <w:r>
+        <w:t xml:space="preserve">    </w:t>
+      </w:r>
+      <w:r/>
+    </w:p>
+    <w:p>
+      <w:pPr>
+        <w:pStyle w:val="33"/>
+        <w:pBdr/>
+        <w:spacing/>
+        <w:ind/>
+        <w:rPr/>
+      </w:pPr>
+      <w:r>
+        <w:t xml:space="preserve">    return head;</w:t>
+      </w:r>
+      <w:r/>
+    </w:p>
+    <w:p>
+      <w:pPr>
+        <w:pStyle w:val="33"/>
+        <w:pBdr/>
+        <w:spacing/>
+        <w:ind/>
+        <w:rPr/>
+      </w:pPr>
+      <w:r>
+        <w:t xml:space="preserve">}</w:t>
+      </w:r>
+      <w:r/>
+    </w:p>
+    <w:p>
+      <w:pPr>
+        <w:pStyle w:val="33"/>
+        <w:pBdr/>
+        <w:spacing/>
+        <w:ind/>
+        <w:rPr/>
+      </w:pPr>
+      <w:r/>
+      <w:r/>
+    </w:p>
+    <w:p>
+      <w:pPr>
+        <w:pStyle w:val="33"/>
+        <w:pBdr/>
+        <w:spacing/>
+        <w:ind/>
+        <w:rPr/>
+      </w:pPr>
+      <w:r>
+        <w:t xml:space="preserve">// Hulpfunctie: print de linked list</w:t>
+      </w:r>
+      <w:r/>
+    </w:p>
+    <w:p>
+      <w:pPr>
+        <w:pStyle w:val="33"/>
+        <w:pBdr/>
+        <w:spacing/>
+        <w:ind/>
+        <w:rPr/>
+      </w:pPr>
+      <w:r>
+        <w:t xml:space="preserve">void printLinkedList(struct node* head) {</w:t>
+      </w:r>
+      <w:r/>
+    </w:p>
+    <w:p>
+      <w:pPr>
+        <w:pStyle w:val="33"/>
+        <w:pBdr/>
+        <w:spacing/>
+        <w:ind/>
+        <w:rPr/>
+      </w:pPr>
+      <w:r>
+        <w:t xml:space="preserve">    printf("Linked List: ");</w:t>
+      </w:r>
+      <w:r/>
+    </w:p>
+    <w:p>
+      <w:pPr>
+        <w:pStyle w:val="33"/>
+        <w:pBdr/>
+        <w:spacing/>
+        <w:ind/>
+        <w:rPr/>
+      </w:pPr>
+      <w:r>
+        <w:t xml:space="preserve">    struct node* current = head;</w:t>
+      </w:r>
+      <w:r/>
+    </w:p>
+    <w:p>
+      <w:pPr>
+        <w:pStyle w:val="33"/>
+        <w:pBdr/>
+        <w:spacing/>
+        <w:ind/>
+        <w:rPr/>
+      </w:pPr>
+      <w:r>
+        <w:t xml:space="preserve">    while (current != NULL) {</w:t>
+      </w:r>
+      <w:r/>
+    </w:p>
+    <w:p>
+      <w:pPr>
+        <w:pStyle w:val="33"/>
+        <w:pBdr/>
+        <w:spacing/>
+        <w:ind/>
+        <w:rPr/>
+      </w:pPr>
+      <w:r>
+        <w:t xml:space="preserve">        printf("%d -&gt; ", current-&gt;data);</w:t>
+      </w:r>
+      <w:r/>
+    </w:p>
+    <w:p>
+      <w:pPr>
+        <w:pStyle w:val="33"/>
+        <w:pBdr/>
+        <w:spacing/>
+        <w:ind/>
+        <w:rPr/>
+      </w:pPr>
+      <w:r>
+        <w:t xml:space="preserve">        current = current-&gt;next;</w:t>
+      </w:r>
+      <w:r/>
+    </w:p>
+    <w:p>
+      <w:pPr>
+        <w:pStyle w:val="33"/>
+        <w:pBdr/>
+        <w:spacing/>
+        <w:ind/>
+        <w:rPr/>
+      </w:pPr>
+      <w:r>
+        <w:t xml:space="preserve">    }</w:t>
+      </w:r>
+      <w:r/>
+    </w:p>
+    <w:p>
+      <w:pPr>
+        <w:pStyle w:val="33"/>
+        <w:pBdr/>
+        <w:spacing/>
+        <w:ind/>
+        <w:rPr/>
+      </w:pPr>
+      <w:r>
+        <w:t xml:space="preserve">    printf("NULL\n");</w:t>
+      </w:r>
+      <w:r/>
+    </w:p>
+    <w:p>
+      <w:pPr>
+        <w:pStyle w:val="33"/>
+        <w:pBdr/>
+        <w:spacing/>
+        <w:ind/>
+        <w:rPr/>
+      </w:pPr>
+      <w:r>
+        <w:t xml:space="preserve">}</w:t>
+      </w:r>
+      <w:r/>
+    </w:p>
+    <w:p>
+      <w:pPr>
+        <w:pStyle w:val="33"/>
+        <w:pBdr/>
+        <w:spacing/>
+        <w:ind/>
+        <w:rPr/>
+      </w:pPr>
+      <w:r/>
+      <w:r/>
+    </w:p>
+    <w:p>
+      <w:pPr>
+        <w:pStyle w:val="33"/>
+        <w:pBdr/>
+        <w:spacing/>
+        <w:ind/>
+        <w:rPr/>
+      </w:pPr>
+      <w:r>
+        <w:t xml:space="preserve">// Hulpfunctie: geef aantal nodes in de linked list</w:t>
+      </w:r>
+      <w:r/>
+    </w:p>
+    <w:p>
+      <w:pPr>
+        <w:pStyle w:val="33"/>
+        <w:pBdr/>
+        <w:spacing/>
+        <w:ind/>
+        <w:rPr/>
+      </w:pPr>
+      <w:r>
+        <w:t xml:space="preserve">int listLength(struct node* head) {</w:t>
+      </w:r>
+      <w:r/>
+    </w:p>
+    <w:p>
+      <w:pPr>
+        <w:pStyle w:val="33"/>
+        <w:pBdr/>
+        <w:spacing/>
+        <w:ind/>
+        <w:rPr/>
+      </w:pPr>
+      <w:r>
+        <w:t xml:space="preserve">    int count = 0;</w:t>
+      </w:r>
+      <w:r/>
+    </w:p>
+    <w:p>
+      <w:pPr>
+        <w:pStyle w:val="33"/>
+        <w:pBdr/>
+        <w:spacing/>
+        <w:ind/>
+        <w:rPr/>
+      </w:pPr>
+      <w:r>
+        <w:t xml:space="preserve">    struct node* current = head;</w:t>
+      </w:r>
+      <w:r/>
+    </w:p>
+    <w:p>
+      <w:pPr>
+        <w:pStyle w:val="33"/>
+        <w:pBdr/>
+        <w:spacing/>
+        <w:ind/>
+        <w:rPr/>
+      </w:pPr>
+      <w:r>
+        <w:t xml:space="preserve">    while (current != NULL) {</w:t>
+      </w:r>
+      <w:r/>
+    </w:p>
+    <w:p>
+      <w:pPr>
+        <w:pStyle w:val="33"/>
+        <w:pBdr/>
+        <w:spacing/>
+        <w:ind/>
+        <w:rPr/>
+      </w:pPr>
+      <w:r>
+        <w:t xml:space="preserve">        count++;</w:t>
+      </w:r>
+      <w:r/>
+    </w:p>
+    <w:p>
+      <w:pPr>
+        <w:pStyle w:val="33"/>
+        <w:pBdr/>
+        <w:spacing/>
+        <w:ind/>
+        <w:rPr/>
+      </w:pPr>
+      <w:r>
+        <w:t xml:space="preserve">        current = current-&gt;next;</w:t>
+      </w:r>
+      <w:r/>
+    </w:p>
+    <w:p>
+      <w:pPr>
+        <w:pStyle w:val="33"/>
+        <w:pBdr/>
+        <w:spacing/>
+        <w:ind/>
+        <w:rPr/>
+      </w:pPr>
+      <w:r>
+        <w:t xml:space="preserve">    }</w:t>
+      </w:r>
+      <w:r/>
+    </w:p>
+    <w:p>
+      <w:pPr>
+        <w:pStyle w:val="33"/>
+        <w:pBdr/>
+        <w:spacing/>
+        <w:ind/>
+        <w:rPr/>
+      </w:pPr>
+      <w:r>
+        <w:t xml:space="preserve">    return count;</w:t>
+      </w:r>
+      <w:r/>
+    </w:p>
+    <w:p>
+      <w:pPr>
+        <w:pStyle w:val="33"/>
+        <w:pBdr/>
+        <w:spacing/>
+        <w:ind/>
+        <w:rPr/>
+      </w:pPr>
+      <w:r>
+        <w:t xml:space="preserve">}</w:t>
+      </w:r>
+      <w:r/>
+    </w:p>
+    <w:p>
+      <w:pPr>
+        <w:pStyle w:val="33"/>
+        <w:pBdr/>
+        <w:spacing/>
+        <w:ind/>
+        <w:rPr/>
+      </w:pPr>
+      <w:r/>
+      <w:r/>
+    </w:p>
+    <w:p>
+      <w:pPr>
+        <w:pStyle w:val="33"/>
+        <w:pBdr/>
+        <w:spacing/>
+        <w:ind/>
+        <w:rPr/>
+      </w:pPr>
+      <w:r>
+        <w:t xml:space="preserve">// ========== FUNCTIE b) ==========</w:t>
+      </w:r>
+      <w:r/>
+    </w:p>
+    <w:p>
+      <w:pPr>
+        <w:pStyle w:val="33"/>
+        <w:pBdr/>
+        <w:spacing/>
+        <w:ind/>
+        <w:rPr/>
+      </w:pPr>
+      <w:r>
+        <w:t xml:space="preserve">// Verwijder een node op basis van positie (1-gebaseerd)</w:t>
+      </w:r>
+      <w:r/>
+    </w:p>
+    <w:p>
+      <w:pPr>
+        <w:pStyle w:val="33"/>
+        <w:pBdr/>
+        <w:spacing/>
+        <w:ind/>
+        <w:rPr/>
+      </w:pPr>
+      <w:r>
+        <w:t xml:space="preserve">struct node* deleteNodeByPosition(struct node* head, int position) {</w:t>
+      </w:r>
+      <w:r/>
+    </w:p>
+    <w:p>
+      <w:pPr>
+        <w:pStyle w:val="33"/>
+        <w:pBdr/>
+        <w:spacing/>
+        <w:ind/>
+        <w:rPr/>
+      </w:pPr>
+      <w:r>
+        <w:t xml:space="preserve">    if (head == NULL) {</w:t>
+      </w:r>
+      <w:r/>
+    </w:p>
+    <w:p>
+      <w:pPr>
+        <w:pStyle w:val="33"/>
+        <w:pBdr/>
+        <w:spacing/>
+        <w:ind/>
+        <w:rPr/>
+      </w:pPr>
+      <w:r>
+        <w:t xml:space="preserve">        printf("Linked list is leeg!\n");</w:t>
+      </w:r>
+      <w:r/>
+    </w:p>
+    <w:p>
+      <w:pPr>
+        <w:pStyle w:val="33"/>
+        <w:pBdr/>
+        <w:spacing/>
+        <w:ind/>
+        <w:rPr/>
+      </w:pPr>
+      <w:r>
+        <w:t xml:space="preserve">        return NULL;</w:t>
+      </w:r>
+      <w:r/>
+    </w:p>
+    <w:p>
+      <w:pPr>
+        <w:pStyle w:val="33"/>
+        <w:pBdr/>
+        <w:spacing/>
+        <w:ind/>
+        <w:rPr/>
+      </w:pPr>
+      <w:r>
+        <w:t xml:space="preserve">    }</w:t>
+      </w:r>
+      <w:r/>
+    </w:p>
+    <w:p>
+      <w:pPr>
+        <w:pStyle w:val="33"/>
+        <w:pBdr/>
+        <w:spacing/>
+        <w:ind/>
+        <w:rPr/>
+      </w:pPr>
+      <w:r>
+        <w:t xml:space="preserve">    </w:t>
+      </w:r>
+      <w:r/>
+    </w:p>
+    <w:p>
+      <w:pPr>
+        <w:pStyle w:val="33"/>
+        <w:pBdr/>
+        <w:spacing/>
+        <w:ind/>
+        <w:rPr/>
+      </w:pPr>
+      <w:r>
+        <w:t xml:space="preserve">    // Verwijder het eerste element (position 1)</w:t>
+      </w:r>
+      <w:r/>
+    </w:p>
+    <w:p>
+      <w:pPr>
+        <w:pStyle w:val="33"/>
+        <w:pBdr/>
+        <w:spacing/>
+        <w:ind/>
+        <w:rPr/>
+      </w:pPr>
+      <w:r>
+        <w:t xml:space="preserve">    if (position == 1) {</w:t>
+      </w:r>
+      <w:r/>
+    </w:p>
+    <w:p>
+      <w:pPr>
+        <w:pStyle w:val="33"/>
+        <w:pBdr/>
+        <w:spacing/>
+        <w:ind/>
+        <w:rPr/>
+      </w:pPr>
+      <w:r>
+        <w:t xml:space="preserve">        struct node* temp = head;</w:t>
+      </w:r>
+      <w:r/>
+    </w:p>
+    <w:p>
+      <w:pPr>
+        <w:pStyle w:val="33"/>
+        <w:pBdr/>
+        <w:spacing/>
+        <w:ind/>
+        <w:rPr/>
+      </w:pPr>
+      <w:r>
+        <w:t xml:space="preserve">        head = head-&gt;next;</w:t>
+      </w:r>
+      <w:r/>
+    </w:p>
+    <w:p>
+      <w:pPr>
+        <w:pStyle w:val="33"/>
+        <w:pBdr/>
+        <w:spacing/>
+        <w:ind/>
+        <w:rPr/>
+      </w:pPr>
+      <w:r>
+        <w:t xml:space="preserve">        free(temp);</w:t>
+      </w:r>
+      <w:r/>
+    </w:p>
+    <w:p>
+      <w:pPr>
+        <w:pStyle w:val="33"/>
+        <w:pBdr/>
+        <w:spacing/>
+        <w:ind/>
+        <w:rPr/>
+      </w:pPr>
+      <w:r>
+        <w:t xml:space="preserve">        printf("Node op positie %d verwijderd.\n", position);</w:t>
+      </w:r>
+      <w:r/>
+    </w:p>
+    <w:p>
+      <w:pPr>
+        <w:pStyle w:val="33"/>
+        <w:pBdr/>
+        <w:spacing/>
+        <w:ind/>
+        <w:rPr/>
+      </w:pPr>
+      <w:r>
+        <w:t xml:space="preserve">        return head;</w:t>
+      </w:r>
+      <w:r/>
+    </w:p>
+    <w:p>
+      <w:pPr>
+        <w:pStyle w:val="33"/>
+        <w:pBdr/>
+        <w:spacing/>
+        <w:ind/>
+        <w:rPr/>
+      </w:pPr>
+      <w:r>
+        <w:t xml:space="preserve">    }</w:t>
+      </w:r>
+      <w:r/>
+    </w:p>
+    <w:p>
+      <w:pPr>
+        <w:pStyle w:val="33"/>
+        <w:pBdr/>
+        <w:spacing/>
+        <w:ind/>
+        <w:rPr/>
+      </w:pPr>
+      <w:r>
+        <w:t xml:space="preserve">    </w:t>
+      </w:r>
+      <w:r/>
+    </w:p>
+    <w:p>
+      <w:pPr>
+        <w:pStyle w:val="33"/>
+        <w:pBdr/>
+        <w:spacing/>
+        <w:ind/>
+        <w:rPr/>
+      </w:pPr>
+      <w:r>
+        <w:t xml:space="preserve">    // Zoek de node voor de te verwijderen node</w:t>
+      </w:r>
+      <w:r/>
+    </w:p>
+    <w:p>
+      <w:pPr>
+        <w:pStyle w:val="33"/>
+        <w:pBdr/>
+        <w:spacing/>
+        <w:ind/>
+        <w:rPr/>
+      </w:pPr>
+      <w:r>
+        <w:t xml:space="preserve">    struct node* current = head;</w:t>
+      </w:r>
+      <w:r/>
+    </w:p>
+    <w:p>
+      <w:pPr>
+        <w:pStyle w:val="33"/>
+        <w:pBdr/>
+        <w:spacing/>
+        <w:ind/>
+        <w:rPr/>
+      </w:pPr>
+      <w:r>
+        <w:t xml:space="preserve">    int count = 1;</w:t>
+      </w:r>
+      <w:r/>
+    </w:p>
+    <w:p>
+      <w:pPr>
+        <w:pStyle w:val="33"/>
+        <w:pBdr/>
+        <w:spacing/>
+        <w:ind/>
+        <w:rPr/>
+      </w:pPr>
+      <w:r>
+        <w:t xml:space="preserve">    </w:t>
+      </w:r>
+      <w:r/>
+    </w:p>
+    <w:p>
+      <w:pPr>
+        <w:pStyle w:val="33"/>
+        <w:pBdr/>
+        <w:spacing/>
+        <w:ind/>
+        <w:rPr/>
+      </w:pPr>
+      <w:r>
+        <w:t xml:space="preserve">    while (current-&gt;next != NULL &amp;&amp; count &lt; position - 1) {</w:t>
+      </w:r>
+      <w:r/>
+    </w:p>
+    <w:p>
+      <w:pPr>
+        <w:pStyle w:val="33"/>
+        <w:pBdr/>
+        <w:spacing/>
+        <w:ind/>
+        <w:rPr/>
+      </w:pPr>
+      <w:r>
+        <w:t xml:space="preserve">        current = current-&gt;next;</w:t>
+      </w:r>
+      <w:r/>
+    </w:p>
+    <w:p>
+      <w:pPr>
+        <w:pStyle w:val="33"/>
+        <w:pBdr/>
+        <w:spacing/>
+        <w:ind/>
+        <w:rPr/>
+      </w:pPr>
+      <w:r>
+        <w:t xml:space="preserve">        count++;</w:t>
+      </w:r>
+      <w:r/>
+    </w:p>
+    <w:p>
+      <w:pPr>
+        <w:pStyle w:val="33"/>
+        <w:pBdr/>
+        <w:spacing/>
+        <w:ind/>
+        <w:rPr/>
+      </w:pPr>
+      <w:r>
+        <w:t xml:space="preserve">    }</w:t>
+      </w:r>
+      <w:r/>
+    </w:p>
+    <w:p>
+      <w:pPr>
+        <w:pStyle w:val="33"/>
+        <w:pBdr/>
+        <w:spacing/>
+        <w:ind/>
+        <w:rPr/>
+      </w:pPr>
+      <w:r>
+        <w:t xml:space="preserve">    </w:t>
+      </w:r>
+      <w:r/>
+    </w:p>
+    <w:p>
+      <w:pPr>
+        <w:pStyle w:val="33"/>
+        <w:pBdr/>
+        <w:spacing/>
+        <w:ind/>
+        <w:rPr/>
+      </w:pPr>
+      <w:r>
+        <w:t xml:space="preserve">    // Check of we de node hebben gevonden</w:t>
+      </w:r>
+      <w:r/>
+    </w:p>
+    <w:p>
+      <w:pPr>
+        <w:pStyle w:val="33"/>
+        <w:pBdr/>
+        <w:spacing/>
+        <w:ind/>
+        <w:rPr/>
+      </w:pPr>
+      <w:r>
+        <w:t xml:space="preserve">    if (current-&gt;next == NULL || count != position - 1) {</w:t>
+      </w:r>
+      <w:r/>
+    </w:p>
+    <w:p>
+      <w:pPr>
+        <w:pStyle w:val="33"/>
+        <w:pBdr/>
+        <w:spacing/>
+        <w:ind/>
+        <w:rPr/>
+      </w:pPr>
+      <w:r>
+        <w:t xml:space="preserve">        printf("Positie %d bestaat niet!\n", position);</w:t>
+      </w:r>
+      <w:r/>
+    </w:p>
+    <w:p>
+      <w:pPr>
+        <w:pStyle w:val="33"/>
+        <w:pBdr/>
+        <w:spacing/>
+        <w:ind/>
+        <w:rPr/>
+      </w:pPr>
+      <w:r>
+        <w:t xml:space="preserve">        return head;</w:t>
+      </w:r>
+      <w:r/>
+    </w:p>
+    <w:p>
+      <w:pPr>
+        <w:pStyle w:val="33"/>
+        <w:pBdr/>
+        <w:spacing/>
+        <w:ind/>
+        <w:rPr/>
+      </w:pPr>
+      <w:r>
+        <w:t xml:space="preserve">    }</w:t>
+      </w:r>
+      <w:r/>
+    </w:p>
+    <w:p>
+      <w:pPr>
+        <w:pStyle w:val="33"/>
+        <w:pBdr/>
+        <w:spacing/>
+        <w:ind/>
+        <w:rPr/>
+      </w:pPr>
+      <w:r>
+        <w:t xml:space="preserve">    </w:t>
+      </w:r>
+      <w:r/>
+    </w:p>
+    <w:p>
+      <w:pPr>
+        <w:pStyle w:val="33"/>
+        <w:pBdr/>
+        <w:spacing/>
+        <w:ind/>
+        <w:rPr/>
+      </w:pPr>
+      <w:r>
+        <w:t xml:space="preserve">    // Verwijder de node</w:t>
+      </w:r>
+      <w:r/>
+    </w:p>
+    <w:p>
+      <w:pPr>
+        <w:pStyle w:val="33"/>
+        <w:pBdr/>
+        <w:spacing/>
+        <w:ind/>
+        <w:rPr/>
+      </w:pPr>
+      <w:r>
+        <w:t xml:space="preserve">    struct node* temp = current-&gt;next;</w:t>
+      </w:r>
+      <w:r/>
+    </w:p>
+    <w:p>
+      <w:pPr>
+        <w:pStyle w:val="33"/>
+        <w:pBdr/>
+        <w:spacing/>
+        <w:ind/>
+        <w:rPr/>
+      </w:pPr>
+      <w:r>
+        <w:t xml:space="preserve">    current-&gt;next = temp-&gt;next;</w:t>
+      </w:r>
+      <w:r/>
+    </w:p>
+    <w:p>
+      <w:pPr>
+        <w:pStyle w:val="33"/>
+        <w:pBdr/>
+        <w:spacing/>
+        <w:ind/>
+        <w:rPr/>
+      </w:pPr>
+      <w:r>
+        <w:t xml:space="preserve">    free(temp);</w:t>
+      </w:r>
+      <w:r/>
+    </w:p>
+    <w:p>
+      <w:pPr>
+        <w:pStyle w:val="33"/>
+        <w:pBdr/>
+        <w:spacing/>
+        <w:ind/>
+        <w:rPr/>
+      </w:pPr>
+      <w:r>
+        <w:t xml:space="preserve">    printf("Node op positie %d verwijderd.\n", position);</w:t>
+      </w:r>
+      <w:r/>
+    </w:p>
+    <w:p>
+      <w:pPr>
+        <w:pStyle w:val="33"/>
+        <w:pBdr/>
+        <w:spacing/>
+        <w:ind/>
+        <w:rPr/>
+      </w:pPr>
+      <w:r>
+        <w:t xml:space="preserve">    </w:t>
+      </w:r>
+      <w:r/>
+    </w:p>
+    <w:p>
+      <w:pPr>
+        <w:pStyle w:val="33"/>
+        <w:pBdr/>
+        <w:spacing/>
+        <w:ind/>
+        <w:rPr/>
+      </w:pPr>
+      <w:r>
+        <w:t xml:space="preserve">    return head;</w:t>
+      </w:r>
+      <w:r/>
+    </w:p>
+    <w:p>
+      <w:pPr>
+        <w:pStyle w:val="33"/>
+        <w:pBdr/>
+        <w:spacing/>
+        <w:ind/>
+        <w:rPr/>
+      </w:pPr>
+      <w:r>
+        <w:t xml:space="preserve">}</w:t>
+      </w:r>
+      <w:r/>
+    </w:p>
+    <w:p>
+      <w:pPr>
+        <w:pStyle w:val="33"/>
+        <w:pBdr/>
+        <w:spacing/>
+        <w:ind/>
+        <w:rPr/>
+      </w:pPr>
+      <w:r/>
+      <w:r/>
+    </w:p>
+    <w:p>
+      <w:pPr>
+        <w:pStyle w:val="33"/>
+        <w:pBdr/>
+        <w:spacing/>
+        <w:ind/>
+        <w:rPr/>
+      </w:pPr>
+      <w:r>
+        <w:t xml:space="preserve">// ========== FUNCTIE c) ==========</w:t>
+      </w:r>
+      <w:r/>
+    </w:p>
+    <w:p>
+      <w:pPr>
+        <w:pStyle w:val="33"/>
+        <w:pBdr/>
+        <w:spacing/>
+        <w:ind/>
+        <w:rPr/>
+      </w:pPr>
+      <w:r>
+        <w:t xml:space="preserve">// Verwijder het eerste negatieve getal</w:t>
+      </w:r>
+      <w:r/>
+    </w:p>
+    <w:p>
+      <w:pPr>
+        <w:pStyle w:val="33"/>
+        <w:pBdr/>
+        <w:spacing/>
+        <w:ind/>
+        <w:rPr/>
+      </w:pPr>
+      <w:r>
+        <w:t xml:space="preserve">struct node* deleteFirstNegative(struct node* head) {</w:t>
+      </w:r>
+      <w:r/>
+    </w:p>
+    <w:p>
+      <w:pPr>
+        <w:pStyle w:val="33"/>
+        <w:pBdr/>
+        <w:spacing/>
+        <w:ind/>
+        <w:rPr/>
+      </w:pPr>
+      <w:r>
+        <w:t xml:space="preserve">    if (head == NULL) {</w:t>
+      </w:r>
+      <w:r/>
+    </w:p>
+    <w:p>
+      <w:pPr>
+        <w:pStyle w:val="33"/>
+        <w:pBdr/>
+        <w:spacing/>
+        <w:ind/>
+        <w:rPr/>
+      </w:pPr>
+      <w:r>
+        <w:t xml:space="preserve">        printf("Linked list is leeg!\n");</w:t>
+      </w:r>
+      <w:r/>
+    </w:p>
+    <w:p>
+      <w:pPr>
+        <w:pStyle w:val="33"/>
+        <w:pBdr/>
+        <w:spacing/>
+        <w:ind/>
+        <w:rPr/>
+      </w:pPr>
+      <w:r>
+        <w:t xml:space="preserve">        return NULL;</w:t>
+      </w:r>
+      <w:r/>
+    </w:p>
+    <w:p>
+      <w:pPr>
+        <w:pStyle w:val="33"/>
+        <w:pBdr/>
+        <w:spacing/>
+        <w:ind/>
+        <w:rPr/>
+      </w:pPr>
+      <w:r>
+        <w:t xml:space="preserve">    }</w:t>
+      </w:r>
+      <w:r/>
+    </w:p>
+    <w:p>
+      <w:pPr>
+        <w:pStyle w:val="33"/>
+        <w:pBdr/>
+        <w:spacing/>
+        <w:ind/>
+        <w:rPr/>
+      </w:pPr>
+      <w:r>
+        <w:t xml:space="preserve">    </w:t>
+      </w:r>
+      <w:r/>
+    </w:p>
+    <w:p>
+      <w:pPr>
+        <w:pStyle w:val="33"/>
+        <w:pBdr/>
+        <w:spacing/>
+        <w:ind/>
+        <w:rPr/>
+      </w:pPr>
+      <w:r>
+        <w:t xml:space="preserve">    // Check het eerste element</w:t>
+      </w:r>
+      <w:r/>
+    </w:p>
+    <w:p>
+      <w:pPr>
+        <w:pStyle w:val="33"/>
+        <w:pBdr/>
+        <w:spacing/>
+        <w:ind/>
+        <w:rPr/>
+      </w:pPr>
+      <w:r>
+        <w:t xml:space="preserve">    if (head-&gt;data &lt; 0) {</w:t>
+      </w:r>
+      <w:r/>
+    </w:p>
+    <w:p>
+      <w:pPr>
+        <w:pStyle w:val="33"/>
+        <w:pBdr/>
+        <w:spacing/>
+        <w:ind/>
+        <w:rPr/>
+      </w:pPr>
+      <w:r>
+        <w:t xml:space="preserve">        struct node* temp = head;</w:t>
+      </w:r>
+      <w:r/>
+    </w:p>
+    <w:p>
+      <w:pPr>
+        <w:pStyle w:val="33"/>
+        <w:pBdr/>
+        <w:spacing/>
+        <w:ind/>
+        <w:rPr/>
+      </w:pPr>
+      <w:r>
+        <w:t xml:space="preserve">        head = head-&gt;next;</w:t>
+      </w:r>
+      <w:r/>
+    </w:p>
+    <w:p>
+      <w:pPr>
+        <w:pStyle w:val="33"/>
+        <w:pBdr/>
+        <w:spacing/>
+        <w:ind/>
+        <w:rPr/>
+      </w:pPr>
+      <w:r>
+        <w:t xml:space="preserve">        printf("Eerste negatieve getal (%d) verwijderd.\n", temp-&gt;data);</w:t>
+      </w:r>
+      <w:r/>
+    </w:p>
+    <w:p>
+      <w:pPr>
+        <w:pStyle w:val="33"/>
+        <w:pBdr/>
+        <w:spacing/>
+        <w:ind/>
+        <w:rPr/>
+      </w:pPr>
+      <w:r>
+        <w:t xml:space="preserve">        free(temp);</w:t>
+      </w:r>
+      <w:r/>
+    </w:p>
+    <w:p>
+      <w:pPr>
+        <w:pStyle w:val="33"/>
+        <w:pBdr/>
+        <w:spacing/>
+        <w:ind/>
+        <w:rPr/>
+      </w:pPr>
+      <w:r>
+        <w:t xml:space="preserve">        return head;</w:t>
+      </w:r>
+      <w:r/>
+    </w:p>
+    <w:p>
+      <w:pPr>
+        <w:pStyle w:val="33"/>
+        <w:pBdr/>
+        <w:spacing/>
+        <w:ind/>
+        <w:rPr/>
+      </w:pPr>
+      <w:r>
+        <w:t xml:space="preserve">    }</w:t>
+      </w:r>
+      <w:r/>
+    </w:p>
+    <w:p>
+      <w:pPr>
+        <w:pStyle w:val="33"/>
+        <w:pBdr/>
+        <w:spacing/>
+        <w:ind/>
+        <w:rPr/>
+      </w:pPr>
+      <w:r>
+        <w:t xml:space="preserve">    </w:t>
+      </w:r>
+      <w:r/>
+    </w:p>
+    <w:p>
+      <w:pPr>
+        <w:pStyle w:val="33"/>
+        <w:pBdr/>
+        <w:spacing/>
+        <w:ind/>
+        <w:rPr/>
+      </w:pPr>
+      <w:r>
+        <w:t xml:space="preserve">    // Zoek het eerste negatieve getal</w:t>
+      </w:r>
+      <w:r/>
+    </w:p>
+    <w:p>
+      <w:pPr>
+        <w:pStyle w:val="33"/>
+        <w:pBdr/>
+        <w:spacing/>
+        <w:ind/>
+        <w:rPr/>
+      </w:pPr>
+      <w:r>
+        <w:t xml:space="preserve">    struct node* current = head;</w:t>
+      </w:r>
+      <w:r/>
+    </w:p>
+    <w:p>
+      <w:pPr>
+        <w:pStyle w:val="33"/>
+        <w:pBdr/>
+        <w:spacing/>
+        <w:ind/>
+        <w:rPr/>
+      </w:pPr>
+      <w:r>
+        <w:t xml:space="preserve">    while (current-&gt;next != NULL &amp;&amp; current-&gt;next-&gt;data &gt;= 0) {</w:t>
+      </w:r>
+      <w:r/>
+    </w:p>
+    <w:p>
+      <w:pPr>
+        <w:pStyle w:val="33"/>
+        <w:pBdr/>
+        <w:spacing/>
+        <w:ind/>
+        <w:rPr/>
+      </w:pPr>
+      <w:r>
+        <w:t xml:space="preserve">        current = current-&gt;next;</w:t>
+      </w:r>
+      <w:r/>
+    </w:p>
+    <w:p>
+      <w:pPr>
+        <w:pStyle w:val="33"/>
+        <w:pBdr/>
+        <w:spacing/>
+        <w:ind/>
+        <w:rPr/>
+      </w:pPr>
+      <w:r>
+        <w:t xml:space="preserve">    }</w:t>
+      </w:r>
+      <w:r/>
+    </w:p>
+    <w:p>
+      <w:pPr>
+        <w:pStyle w:val="33"/>
+        <w:pBdr/>
+        <w:spacing/>
+        <w:ind/>
+        <w:rPr/>
+      </w:pPr>
+      <w:r>
+        <w:t xml:space="preserve">    </w:t>
+      </w:r>
+      <w:r/>
+    </w:p>
+    <w:p>
+      <w:pPr>
+        <w:pStyle w:val="33"/>
+        <w:pBdr/>
+        <w:spacing/>
+        <w:ind/>
+        <w:rPr/>
+      </w:pPr>
+      <w:r>
+        <w:t xml:space="preserve">    // Verwijder het getal als het gevonden is</w:t>
+      </w:r>
+      <w:r/>
+    </w:p>
+    <w:p>
+      <w:pPr>
+        <w:pStyle w:val="33"/>
+        <w:pBdr/>
+        <w:spacing/>
+        <w:ind/>
+        <w:rPr/>
+      </w:pPr>
+      <w:r>
+        <w:t xml:space="preserve">    if (current-&gt;next != NULL) {</w:t>
+      </w:r>
+      <w:r/>
+    </w:p>
+    <w:p>
+      <w:pPr>
+        <w:pStyle w:val="33"/>
+        <w:pBdr/>
+        <w:spacing/>
+        <w:ind/>
+        <w:rPr/>
+      </w:pPr>
+      <w:r>
+        <w:t xml:space="preserve">        struct node* temp = current-&gt;next;</w:t>
+      </w:r>
+      <w:r/>
+    </w:p>
+    <w:p>
+      <w:pPr>
+        <w:pStyle w:val="33"/>
+        <w:pBdr/>
+        <w:spacing/>
+        <w:ind/>
+        <w:rPr/>
+      </w:pPr>
+      <w:r>
+        <w:t xml:space="preserve">        current-&gt;next = temp-&gt;next;</w:t>
+      </w:r>
+      <w:r/>
+    </w:p>
+    <w:p>
+      <w:pPr>
+        <w:pStyle w:val="33"/>
+        <w:pBdr/>
+        <w:spacing/>
+        <w:ind/>
+        <w:rPr/>
+      </w:pPr>
+      <w:r>
+        <w:t xml:space="preserve">        printf("Eerste negatieve getal (%d) verwijderd.\n", temp-&gt;data);</w:t>
+      </w:r>
+      <w:r/>
+    </w:p>
+    <w:p>
+      <w:pPr>
+        <w:pStyle w:val="33"/>
+        <w:pBdr/>
+        <w:spacing/>
+        <w:ind/>
+        <w:rPr/>
+      </w:pPr>
+      <w:r>
+        <w:t xml:space="preserve">        free(temp);</w:t>
+      </w:r>
+      <w:r/>
+    </w:p>
+    <w:p>
+      <w:pPr>
+        <w:pStyle w:val="33"/>
+        <w:pBdr/>
+        <w:spacing/>
+        <w:ind/>
+        <w:rPr/>
+      </w:pPr>
+      <w:r>
+        <w:t xml:space="preserve">    } else {</w:t>
+      </w:r>
+      <w:r/>
+    </w:p>
+    <w:p>
+      <w:pPr>
+        <w:pStyle w:val="33"/>
+        <w:pBdr/>
+        <w:spacing/>
+        <w:ind/>
+        <w:rPr/>
+      </w:pPr>
+      <w:r>
+        <w:t xml:space="preserve">        printf("Geen negatieve getallen gevonden!\n");</w:t>
+      </w:r>
+      <w:r/>
+    </w:p>
+    <w:p>
+      <w:pPr>
+        <w:pStyle w:val="33"/>
+        <w:pBdr/>
+        <w:spacing/>
+        <w:ind/>
+        <w:rPr/>
+      </w:pPr>
+      <w:r>
+        <w:t xml:space="preserve">    }</w:t>
+      </w:r>
+      <w:r/>
+    </w:p>
+    <w:p>
+      <w:pPr>
+        <w:pStyle w:val="33"/>
+        <w:pBdr/>
+        <w:spacing/>
+        <w:ind/>
+        <w:rPr/>
+      </w:pPr>
+      <w:r>
+        <w:t xml:space="preserve">    </w:t>
+      </w:r>
+      <w:r/>
+    </w:p>
+    <w:p>
+      <w:pPr>
+        <w:pStyle w:val="33"/>
+        <w:pBdr/>
+        <w:spacing/>
+        <w:ind/>
+        <w:rPr/>
+      </w:pPr>
+      <w:r>
+        <w:t xml:space="preserve">    return head;</w:t>
+      </w:r>
+      <w:r/>
+    </w:p>
+    <w:p>
+      <w:pPr>
+        <w:pStyle w:val="33"/>
+        <w:pBdr/>
+        <w:spacing/>
+        <w:ind/>
+        <w:rPr/>
+      </w:pPr>
+      <w:r>
+        <w:t xml:space="preserve">}</w:t>
+      </w:r>
+      <w:r/>
+    </w:p>
+    <w:p>
+      <w:pPr>
+        <w:pStyle w:val="33"/>
+        <w:pBdr/>
+        <w:spacing/>
+        <w:ind/>
+        <w:rPr/>
+      </w:pPr>
+      <w:r/>
+      <w:r/>
+    </w:p>
+    <w:p>
+      <w:pPr>
+        <w:pStyle w:val="33"/>
+        <w:pBdr/>
+        <w:spacing/>
+        <w:ind/>
+        <w:rPr/>
+      </w:pPr>
+      <w:r>
+        <w:t xml:space="preserve">// ========== FUNCTIE d) (OPTIONEEL) ==========</w:t>
+      </w:r>
+      <w:r/>
+    </w:p>
+    <w:p>
+      <w:pPr>
+        <w:pStyle w:val="33"/>
+        <w:pBdr/>
+        <w:spacing/>
+        <w:ind/>
+        <w:rPr/>
+      </w:pPr>
+      <w:r>
+        <w:t xml:space="preserve">// Verwijder alle negatieve getallen</w:t>
+      </w:r>
+      <w:r/>
+    </w:p>
+    <w:p>
+      <w:pPr>
+        <w:pStyle w:val="33"/>
+        <w:pBdr/>
+        <w:spacing/>
+        <w:ind/>
+        <w:rPr/>
+      </w:pPr>
+      <w:r>
+        <w:t xml:space="preserve">struct node* deleteAllNegative(struct node* head) {</w:t>
+      </w:r>
+      <w:r/>
+    </w:p>
+    <w:p>
+      <w:pPr>
+        <w:pStyle w:val="33"/>
+        <w:pBdr/>
+        <w:spacing/>
+        <w:ind/>
+        <w:rPr/>
+      </w:pPr>
+      <w:r>
+        <w:t xml:space="preserve">    if (head == NULL) {</w:t>
+      </w:r>
+      <w:r/>
+    </w:p>
+    <w:p>
+      <w:pPr>
+        <w:pStyle w:val="33"/>
+        <w:pBdr/>
+        <w:spacing/>
+        <w:ind/>
+        <w:rPr/>
+      </w:pPr>
+      <w:r>
+        <w:t xml:space="preserve">        return NULL;</w:t>
+      </w:r>
+      <w:r/>
+    </w:p>
+    <w:p>
+      <w:pPr>
+        <w:pStyle w:val="33"/>
+        <w:pBdr/>
+        <w:spacing/>
+        <w:ind/>
+        <w:rPr/>
+      </w:pPr>
+      <w:r>
+        <w:t xml:space="preserve">    }</w:t>
+      </w:r>
+      <w:r/>
+    </w:p>
+    <w:p>
+      <w:pPr>
+        <w:pStyle w:val="33"/>
+        <w:pBdr/>
+        <w:spacing/>
+        <w:ind/>
+        <w:rPr/>
+      </w:pPr>
+      <w:r>
+        <w:t xml:space="preserve">    </w:t>
+      </w:r>
+      <w:r/>
+    </w:p>
+    <w:p>
+      <w:pPr>
+        <w:pStyle w:val="33"/>
+        <w:pBdr/>
+        <w:spacing/>
+        <w:ind/>
+        <w:rPr/>
+      </w:pPr>
+      <w:r>
+        <w:t xml:space="preserve">    // Verwijder negatieve getallen aan het begin</w:t>
+      </w:r>
+      <w:r/>
+    </w:p>
+    <w:p>
+      <w:pPr>
+        <w:pStyle w:val="33"/>
+        <w:pBdr/>
+        <w:spacing/>
+        <w:ind/>
+        <w:rPr/>
+      </w:pPr>
+      <w:r>
+        <w:t xml:space="preserve">    while (head != NULL &amp;&amp; head-&gt;data &lt; 0) {</w:t>
+      </w:r>
+      <w:r/>
+    </w:p>
+    <w:p>
+      <w:pPr>
+        <w:pStyle w:val="33"/>
+        <w:pBdr/>
+        <w:spacing/>
+        <w:ind/>
+        <w:rPr/>
+      </w:pPr>
+      <w:r>
+        <w:t xml:space="preserve">        struct node* temp = head;</w:t>
+      </w:r>
+      <w:r/>
+    </w:p>
+    <w:p>
+      <w:pPr>
+        <w:pStyle w:val="33"/>
+        <w:pBdr/>
+        <w:spacing/>
+        <w:ind/>
+        <w:rPr/>
+      </w:pPr>
+      <w:r>
+        <w:t xml:space="preserve">        head = head-&gt;next;</w:t>
+      </w:r>
+      <w:r/>
+    </w:p>
+    <w:p>
+      <w:pPr>
+        <w:pStyle w:val="33"/>
+        <w:pBdr/>
+        <w:spacing/>
+        <w:ind/>
+        <w:rPr/>
+      </w:pPr>
+      <w:r>
+        <w:t xml:space="preserve">        free(temp);</w:t>
+      </w:r>
+      <w:r/>
+    </w:p>
+    <w:p>
+      <w:pPr>
+        <w:pStyle w:val="33"/>
+        <w:pBdr/>
+        <w:spacing/>
+        <w:ind/>
+        <w:rPr/>
+      </w:pPr>
+      <w:r>
+        <w:t xml:space="preserve">    }</w:t>
+      </w:r>
+      <w:r/>
+    </w:p>
+    <w:p>
+      <w:pPr>
+        <w:pStyle w:val="33"/>
+        <w:pBdr/>
+        <w:spacing/>
+        <w:ind/>
+        <w:rPr/>
+      </w:pPr>
+      <w:r>
+        <w:t xml:space="preserve">    </w:t>
+      </w:r>
+      <w:r/>
+    </w:p>
+    <w:p>
+      <w:pPr>
+        <w:pStyle w:val="33"/>
+        <w:pBdr/>
+        <w:spacing/>
+        <w:ind/>
+        <w:rPr/>
+      </w:pPr>
+      <w:r>
+        <w:t xml:space="preserve">    // Verwijder negatieve getallen in het midden/einde</w:t>
+      </w:r>
+      <w:r/>
+    </w:p>
+    <w:p>
+      <w:pPr>
+        <w:pStyle w:val="33"/>
+        <w:pBdr/>
+        <w:spacing/>
+        <w:ind/>
+        <w:rPr/>
+      </w:pPr>
+      <w:r>
+        <w:t xml:space="preserve">    if (head != NULL) {</w:t>
+      </w:r>
+      <w:r/>
+    </w:p>
+    <w:p>
+      <w:pPr>
+        <w:pStyle w:val="33"/>
+        <w:pBdr/>
+        <w:spacing/>
+        <w:ind/>
+        <w:rPr/>
+      </w:pPr>
+      <w:r>
+        <w:t xml:space="preserve">        struct node* current = head;</w:t>
+      </w:r>
+      <w:r/>
+    </w:p>
+    <w:p>
+      <w:pPr>
+        <w:pStyle w:val="33"/>
+        <w:pBdr/>
+        <w:spacing/>
+        <w:ind/>
+        <w:rPr/>
+      </w:pPr>
+      <w:r>
+        <w:t xml:space="preserve">        while (current-&gt;next != NULL) {</w:t>
+      </w:r>
+      <w:r/>
+    </w:p>
+    <w:p>
+      <w:pPr>
+        <w:pStyle w:val="33"/>
+        <w:pBdr/>
+        <w:spacing/>
+        <w:ind/>
+        <w:rPr/>
+      </w:pPr>
+      <w:r>
+        <w:t xml:space="preserve">            if (current-&gt;next-&gt;data &lt; 0) {</w:t>
+      </w:r>
+      <w:r/>
+    </w:p>
+    <w:p>
+      <w:pPr>
+        <w:pStyle w:val="33"/>
+        <w:pBdr/>
+        <w:spacing/>
+        <w:ind/>
+        <w:rPr/>
+      </w:pPr>
+      <w:r>
+        <w:t xml:space="preserve">                struct node* temp = current-&gt;next;</w:t>
+      </w:r>
+      <w:r/>
+    </w:p>
+    <w:p>
+      <w:pPr>
+        <w:pStyle w:val="33"/>
+        <w:pBdr/>
+        <w:spacing/>
+        <w:ind/>
+        <w:rPr/>
+      </w:pPr>
+      <w:r>
+        <w:t xml:space="preserve">                current-&gt;next = temp-&gt;next;</w:t>
+      </w:r>
+      <w:r/>
+    </w:p>
+    <w:p>
+      <w:pPr>
+        <w:pStyle w:val="33"/>
+        <w:pBdr/>
+        <w:spacing/>
+        <w:ind/>
+        <w:rPr/>
+      </w:pPr>
+      <w:r>
+        <w:t xml:space="preserve">                free(temp);</w:t>
+      </w:r>
+      <w:r/>
+    </w:p>
+    <w:p>
+      <w:pPr>
+        <w:pStyle w:val="33"/>
+        <w:pBdr/>
+        <w:spacing/>
+        <w:ind/>
+        <w:rPr/>
+      </w:pPr>
+      <w:r>
+        <w:t xml:space="preserve">            } else {</w:t>
+      </w:r>
+      <w:r/>
+    </w:p>
+    <w:p>
+      <w:pPr>
+        <w:pStyle w:val="33"/>
+        <w:pBdr/>
+        <w:spacing/>
+        <w:ind/>
+        <w:rPr/>
+      </w:pPr>
+      <w:r>
+        <w:t xml:space="preserve">                current = current-&gt;next;</w:t>
+      </w:r>
+      <w:r/>
+    </w:p>
+    <w:p>
+      <w:pPr>
+        <w:pStyle w:val="33"/>
+        <w:pBdr/>
+        <w:spacing/>
+        <w:ind/>
+        <w:rPr/>
+      </w:pPr>
+      <w:r>
+        <w:t xml:space="preserve">            }</w:t>
+      </w:r>
+      <w:r/>
+    </w:p>
+    <w:p>
+      <w:pPr>
+        <w:pStyle w:val="33"/>
+        <w:pBdr/>
+        <w:spacing/>
+        <w:ind/>
+        <w:rPr/>
+      </w:pPr>
+      <w:r>
+        <w:t xml:space="preserve">        }</w:t>
+      </w:r>
+      <w:r/>
+    </w:p>
+    <w:p>
+      <w:pPr>
+        <w:pStyle w:val="33"/>
+        <w:pBdr/>
+        <w:spacing/>
+        <w:ind/>
+        <w:rPr/>
+      </w:pPr>
+      <w:r>
+        <w:t xml:space="preserve">    }</w:t>
+      </w:r>
+      <w:r/>
+    </w:p>
+    <w:p>
+      <w:pPr>
+        <w:pStyle w:val="33"/>
+        <w:pBdr/>
+        <w:spacing/>
+        <w:ind/>
+        <w:rPr/>
+      </w:pPr>
+      <w:r>
+        <w:t xml:space="preserve">    </w:t>
+      </w:r>
+      <w:r/>
+    </w:p>
+    <w:p>
+      <w:pPr>
+        <w:pStyle w:val="33"/>
+        <w:pBdr/>
+        <w:spacing/>
+        <w:ind/>
+        <w:rPr/>
+      </w:pPr>
+      <w:r>
+        <w:t xml:space="preserve">    printf("Alle negatieve getallen verwijderd.\n");</w:t>
+      </w:r>
+      <w:r/>
+    </w:p>
+    <w:p>
+      <w:pPr>
+        <w:pStyle w:val="33"/>
+        <w:pBdr/>
+        <w:spacing/>
+        <w:ind/>
+        <w:rPr/>
+      </w:pPr>
+      <w:r>
+        <w:t xml:space="preserve">    return head;</w:t>
+      </w:r>
+      <w:r/>
+    </w:p>
+    <w:p>
+      <w:pPr>
+        <w:pStyle w:val="33"/>
+        <w:pBdr/>
+        <w:spacing/>
+        <w:ind/>
+        <w:rPr/>
+      </w:pPr>
+      <w:r>
+        <w:t xml:space="preserve">}</w:t>
+      </w:r>
+      <w:r/>
+    </w:p>
+    <w:p>
+      <w:pPr>
+        <w:pStyle w:val="33"/>
+        <w:pBdr/>
+        <w:spacing/>
+        <w:ind/>
+        <w:rPr/>
+      </w:pPr>
+      <w:r/>
+      <w:r/>
+    </w:p>
+    <w:p>
+      <w:pPr>
+        <w:pStyle w:val="33"/>
+        <w:pBdr/>
+        <w:spacing/>
+        <w:ind/>
+        <w:rPr/>
+      </w:pPr>
+      <w:r>
+        <w:t xml:space="preserve">// ========== FUNCTIE e) ==========</w:t>
+      </w:r>
+      <w:r/>
+    </w:p>
+    <w:p>
+      <w:pPr>
+        <w:pStyle w:val="33"/>
+        <w:pBdr/>
+        <w:spacing/>
+        <w:ind/>
+        <w:rPr/>
+      </w:pPr>
+      <w:r>
+        <w:t xml:space="preserve">// Voeg een getal toe op bepaalde plek (1-gebaseerd)</w:t>
+      </w:r>
+      <w:r/>
+    </w:p>
+    <w:p>
+      <w:pPr>
+        <w:pStyle w:val="33"/>
+        <w:pBdr/>
+        <w:spacing/>
+        <w:ind/>
+        <w:rPr/>
+      </w:pPr>
+      <w:r>
+        <w:t xml:space="preserve">struct node* insertAtPosition(struct node* head, int data, int position) {</w:t>
+      </w:r>
+      <w:r/>
+    </w:p>
+    <w:p>
+      <w:pPr>
+        <w:pStyle w:val="33"/>
+        <w:pBdr/>
+        <w:spacing/>
+        <w:ind/>
+        <w:rPr/>
+      </w:pPr>
+      <w:r>
+        <w:t xml:space="preserve">    // Voeg in op positie 1</w:t>
+      </w:r>
+      <w:r/>
+    </w:p>
+    <w:p>
+      <w:pPr>
+        <w:pStyle w:val="33"/>
+        <w:pBdr/>
+        <w:spacing/>
+        <w:ind/>
+        <w:rPr/>
+      </w:pPr>
+      <w:r>
+        <w:t xml:space="preserve">    if (position == 1) {</w:t>
+      </w:r>
+      <w:r/>
+    </w:p>
+    <w:p>
+      <w:pPr>
+        <w:pStyle w:val="33"/>
+        <w:pBdr/>
+        <w:spacing/>
+        <w:ind/>
+        <w:rPr/>
+      </w:pPr>
+      <w:r>
+        <w:t xml:space="preserve">        struct node* newNode = (struct node*)malloc(sizeof(struct node));</w:t>
+      </w:r>
+      <w:r/>
+    </w:p>
+    <w:p>
+      <w:pPr>
+        <w:pStyle w:val="33"/>
+        <w:pBdr/>
+        <w:spacing/>
+        <w:ind/>
+        <w:rPr/>
+      </w:pPr>
+      <w:r>
+        <w:t xml:space="preserve">        newNode-&gt;data = data;</w:t>
+      </w:r>
+      <w:r/>
+    </w:p>
+    <w:p>
+      <w:pPr>
+        <w:pStyle w:val="33"/>
+        <w:pBdr/>
+        <w:spacing/>
+        <w:ind/>
+        <w:rPr/>
+      </w:pPr>
+      <w:r>
+        <w:t xml:space="preserve">        newNode-&gt;next = head;</w:t>
+      </w:r>
+      <w:r/>
+    </w:p>
+    <w:p>
+      <w:pPr>
+        <w:pStyle w:val="33"/>
+        <w:pBdr/>
+        <w:spacing/>
+        <w:ind/>
+        <w:rPr/>
+      </w:pPr>
+      <w:r>
+        <w:t xml:space="preserve">        printf("Getal %d ingevoegd op positie 1.\n", data);</w:t>
+      </w:r>
+      <w:r/>
+    </w:p>
+    <w:p>
+      <w:pPr>
+        <w:pStyle w:val="33"/>
+        <w:pBdr/>
+        <w:spacing/>
+        <w:ind/>
+        <w:rPr/>
+      </w:pPr>
+      <w:r>
+        <w:t xml:space="preserve">        return newNode;</w:t>
+      </w:r>
+      <w:r/>
+    </w:p>
+    <w:p>
+      <w:pPr>
+        <w:pStyle w:val="33"/>
+        <w:pBdr/>
+        <w:spacing/>
+        <w:ind/>
+        <w:rPr/>
+      </w:pPr>
+      <w:r>
+        <w:t xml:space="preserve">    }</w:t>
+      </w:r>
+      <w:r/>
+    </w:p>
+    <w:p>
+      <w:pPr>
+        <w:pStyle w:val="33"/>
+        <w:pBdr/>
+        <w:spacing/>
+        <w:ind/>
+        <w:rPr/>
+      </w:pPr>
+      <w:r>
+        <w:t xml:space="preserve">    </w:t>
+      </w:r>
+      <w:r/>
+    </w:p>
+    <w:p>
+      <w:pPr>
+        <w:pStyle w:val="33"/>
+        <w:pBdr/>
+        <w:spacing/>
+        <w:ind/>
+        <w:rPr/>
+      </w:pPr>
+      <w:r>
+        <w:t xml:space="preserve">    // Zoek de positie</w:t>
+      </w:r>
+      <w:r/>
+    </w:p>
+    <w:p>
+      <w:pPr>
+        <w:pStyle w:val="33"/>
+        <w:pBdr/>
+        <w:spacing/>
+        <w:ind/>
+        <w:rPr/>
+      </w:pPr>
+      <w:r>
+        <w:t xml:space="preserve">    struct node* current = head;</w:t>
+      </w:r>
+      <w:r/>
+    </w:p>
+    <w:p>
+      <w:pPr>
+        <w:pStyle w:val="33"/>
+        <w:pBdr/>
+        <w:spacing/>
+        <w:ind/>
+        <w:rPr/>
+      </w:pPr>
+      <w:r>
+        <w:t xml:space="preserve">    int count = 1;</w:t>
+      </w:r>
+      <w:r/>
+    </w:p>
+    <w:p>
+      <w:pPr>
+        <w:pStyle w:val="33"/>
+        <w:pBdr/>
+        <w:spacing/>
+        <w:ind/>
+        <w:rPr/>
+      </w:pPr>
+      <w:r>
+        <w:t xml:space="preserve">    </w:t>
+      </w:r>
+      <w:r/>
+    </w:p>
+    <w:p>
+      <w:pPr>
+        <w:pStyle w:val="33"/>
+        <w:pBdr/>
+        <w:spacing/>
+        <w:ind/>
+        <w:rPr/>
+      </w:pPr>
+      <w:r>
+        <w:t xml:space="preserve">    while (current != NULL &amp;&amp; count &lt; position - 1) {</w:t>
+      </w:r>
+      <w:r/>
+    </w:p>
+    <w:p>
+      <w:pPr>
+        <w:pStyle w:val="33"/>
+        <w:pBdr/>
+        <w:spacing/>
+        <w:ind/>
+        <w:rPr/>
+      </w:pPr>
+      <w:r>
+        <w:t xml:space="preserve">        current = current-&gt;next;</w:t>
+      </w:r>
+      <w:r/>
+    </w:p>
+    <w:p>
+      <w:pPr>
+        <w:pStyle w:val="33"/>
+        <w:pBdr/>
+        <w:spacing/>
+        <w:ind/>
+        <w:rPr/>
+      </w:pPr>
+      <w:r>
+        <w:t xml:space="preserve">        count++;</w:t>
+      </w:r>
+      <w:r/>
+    </w:p>
+    <w:p>
+      <w:pPr>
+        <w:pStyle w:val="33"/>
+        <w:pBdr/>
+        <w:spacing/>
+        <w:ind/>
+        <w:rPr/>
+      </w:pPr>
+      <w:r>
+        <w:t xml:space="preserve">    }</w:t>
+      </w:r>
+      <w:r/>
+    </w:p>
+    <w:p>
+      <w:pPr>
+        <w:pStyle w:val="33"/>
+        <w:pBdr/>
+        <w:spacing/>
+        <w:ind/>
+        <w:rPr/>
+      </w:pPr>
+      <w:r>
+        <w:t xml:space="preserve">    </w:t>
+      </w:r>
+      <w:r/>
+    </w:p>
+    <w:p>
+      <w:pPr>
+        <w:pStyle w:val="33"/>
+        <w:pBdr/>
+        <w:spacing/>
+        <w:ind/>
+        <w:rPr/>
+      </w:pPr>
+      <w:r>
+        <w:t xml:space="preserve">    // Check of positie geldig is</w:t>
+      </w:r>
+      <w:r/>
+    </w:p>
+    <w:p>
+      <w:pPr>
+        <w:pStyle w:val="33"/>
+        <w:pBdr/>
+        <w:spacing/>
+        <w:ind/>
+        <w:rPr/>
+      </w:pPr>
+      <w:r>
+        <w:t xml:space="preserve">    if (current == NULL) {</w:t>
+      </w:r>
+      <w:r/>
+    </w:p>
+    <w:p>
+      <w:pPr>
+        <w:pStyle w:val="33"/>
+        <w:pBdr/>
+        <w:spacing/>
+        <w:ind/>
+        <w:rPr/>
+      </w:pPr>
+      <w:r>
+        <w:t xml:space="preserve">        printf("Positie %d is te ver!\n", position);</w:t>
+      </w:r>
+      <w:r/>
+    </w:p>
+    <w:p>
+      <w:pPr>
+        <w:pStyle w:val="33"/>
+        <w:pBdr/>
+        <w:spacing/>
+        <w:ind/>
+        <w:rPr/>
+      </w:pPr>
+      <w:r>
+        <w:t xml:space="preserve">        return head;</w:t>
+      </w:r>
+      <w:r/>
+    </w:p>
+    <w:p>
+      <w:pPr>
+        <w:pStyle w:val="33"/>
+        <w:pBdr/>
+        <w:spacing/>
+        <w:ind/>
+        <w:rPr/>
+      </w:pPr>
+      <w:r>
+        <w:t xml:space="preserve">    }</w:t>
+      </w:r>
+      <w:r/>
+    </w:p>
+    <w:p>
+      <w:pPr>
+        <w:pStyle w:val="33"/>
+        <w:pBdr/>
+        <w:spacing/>
+        <w:ind/>
+        <w:rPr/>
+      </w:pPr>
+      <w:r>
+        <w:t xml:space="preserve">    </w:t>
+      </w:r>
+      <w:r/>
+    </w:p>
+    <w:p>
+      <w:pPr>
+        <w:pStyle w:val="33"/>
+        <w:pBdr/>
+        <w:spacing/>
+        <w:ind/>
+        <w:rPr/>
+      </w:pPr>
+      <w:r>
+        <w:t xml:space="preserve">    // Voeg de node in</w:t>
+      </w:r>
+      <w:r/>
+    </w:p>
+    <w:p>
+      <w:pPr>
+        <w:pStyle w:val="33"/>
+        <w:pBdr/>
+        <w:spacing/>
+        <w:ind/>
+        <w:rPr/>
+      </w:pPr>
+      <w:r>
+        <w:t xml:space="preserve">    struct node* newNode = (struct node*)malloc(sizeof(struct node));</w:t>
+      </w:r>
+      <w:r/>
+    </w:p>
+    <w:p>
+      <w:pPr>
+        <w:pStyle w:val="33"/>
+        <w:pBdr/>
+        <w:spacing/>
+        <w:ind/>
+        <w:rPr/>
+      </w:pPr>
+      <w:r>
+        <w:t xml:space="preserve">    newNode-&gt;data = data;</w:t>
+      </w:r>
+      <w:r/>
+    </w:p>
+    <w:p>
+      <w:pPr>
+        <w:pStyle w:val="33"/>
+        <w:pBdr/>
+        <w:spacing/>
+        <w:ind/>
+        <w:rPr/>
+      </w:pPr>
+      <w:r>
+        <w:t xml:space="preserve">    newNode-&gt;next = current-&gt;next;</w:t>
+      </w:r>
+      <w:r/>
+    </w:p>
+    <w:p>
+      <w:pPr>
+        <w:pStyle w:val="33"/>
+        <w:pBdr/>
+        <w:spacing/>
+        <w:ind/>
+        <w:rPr/>
+      </w:pPr>
+      <w:r>
+        <w:t xml:space="preserve">    current-&gt;next = newNode;</w:t>
+      </w:r>
+      <w:r/>
+    </w:p>
+    <w:p>
+      <w:pPr>
+        <w:pStyle w:val="33"/>
+        <w:pBdr/>
+        <w:spacing/>
+        <w:ind/>
+        <w:rPr/>
+      </w:pPr>
+      <w:r>
+        <w:t xml:space="preserve">    printf("Getal %d ingevoegd op positie %d.\n", data, position);</w:t>
+      </w:r>
+      <w:r/>
+    </w:p>
+    <w:p>
+      <w:pPr>
+        <w:pStyle w:val="33"/>
+        <w:pBdr/>
+        <w:spacing/>
+        <w:ind/>
+        <w:rPr/>
+      </w:pPr>
+      <w:r>
+        <w:t xml:space="preserve">    </w:t>
+      </w:r>
+      <w:r/>
+    </w:p>
+    <w:p>
+      <w:pPr>
+        <w:pStyle w:val="33"/>
+        <w:pBdr/>
+        <w:spacing/>
+        <w:ind/>
+        <w:rPr/>
+      </w:pPr>
+      <w:r>
+        <w:t xml:space="preserve">    return head;</w:t>
+      </w:r>
+      <w:r/>
+    </w:p>
+    <w:p>
+      <w:pPr>
+        <w:pStyle w:val="33"/>
+        <w:pBdr/>
+        <w:spacing/>
+        <w:ind/>
+        <w:rPr/>
+      </w:pPr>
+      <w:r>
+        <w:t xml:space="preserve">}</w:t>
+      </w:r>
+      <w:r/>
+    </w:p>
+    <w:p>
+      <w:pPr>
+        <w:pStyle w:val="33"/>
+        <w:pBdr/>
+        <w:spacing/>
+        <w:ind/>
+        <w:rPr/>
+      </w:pPr>
+      <w:r/>
+      <w:r/>
+    </w:p>
+    <w:p>
+      <w:pPr>
+        <w:pStyle w:val="33"/>
+        <w:pBdr/>
+        <w:spacing/>
+        <w:ind/>
+        <w:rPr/>
+      </w:pPr>
+      <w:r>
+        <w:t xml:space="preserve">// ========== FUNCTIE f) ==========</w:t>
+      </w:r>
+      <w:r/>
+    </w:p>
+    <w:p>
+      <w:pPr>
+        <w:pStyle w:val="33"/>
+        <w:pBdr/>
+        <w:spacing/>
+        <w:ind/>
+        <w:rPr/>
+      </w:pPr>
+      <w:r>
+        <w:t xml:space="preserve">// Voeg een getal toe op de laatste plek</w:t>
+      </w:r>
+      <w:r/>
+    </w:p>
+    <w:p>
+      <w:pPr>
+        <w:pStyle w:val="33"/>
+        <w:pBdr/>
+        <w:spacing/>
+        <w:ind/>
+        <w:rPr/>
+      </w:pPr>
+      <w:r>
+        <w:t xml:space="preserve">struct node* insertAtEnd(struct node* head, int data) {</w:t>
+      </w:r>
+      <w:r/>
+    </w:p>
+    <w:p>
+      <w:pPr>
+        <w:pStyle w:val="33"/>
+        <w:pBdr/>
+        <w:spacing/>
+        <w:ind/>
+        <w:rPr/>
+      </w:pPr>
+      <w:r>
+        <w:t xml:space="preserve">    struct node* newNode = (struct node*)malloc(sizeof(struct node));</w:t>
+      </w:r>
+      <w:r/>
+    </w:p>
+    <w:p>
+      <w:pPr>
+        <w:pStyle w:val="33"/>
+        <w:pBdr/>
+        <w:spacing/>
+        <w:ind/>
+        <w:rPr/>
+      </w:pPr>
+      <w:r>
+        <w:t xml:space="preserve">    newNode-&gt;data = data;</w:t>
+      </w:r>
+      <w:r/>
+    </w:p>
+    <w:p>
+      <w:pPr>
+        <w:pStyle w:val="33"/>
+        <w:pBdr/>
+        <w:spacing/>
+        <w:ind/>
+        <w:rPr/>
+      </w:pPr>
+      <w:r>
+        <w:t xml:space="preserve">    newNode-&gt;next = NULL;</w:t>
+      </w:r>
+      <w:r/>
+    </w:p>
+    <w:p>
+      <w:pPr>
+        <w:pStyle w:val="33"/>
+        <w:pBdr/>
+        <w:spacing/>
+        <w:ind/>
+        <w:rPr/>
+      </w:pPr>
+      <w:r>
+        <w:t xml:space="preserve">    </w:t>
+      </w:r>
+      <w:r/>
+    </w:p>
+    <w:p>
+      <w:pPr>
+        <w:pStyle w:val="33"/>
+        <w:pBdr/>
+        <w:spacing/>
+        <w:ind/>
+        <w:rPr/>
+      </w:pPr>
+      <w:r>
+        <w:t xml:space="preserve">    // Als list leeg is</w:t>
+      </w:r>
+      <w:r/>
+    </w:p>
+    <w:p>
+      <w:pPr>
+        <w:pStyle w:val="33"/>
+        <w:pBdr/>
+        <w:spacing/>
+        <w:ind/>
+        <w:rPr/>
+      </w:pPr>
+      <w:r>
+        <w:t xml:space="preserve">    if (head == NULL) {</w:t>
+      </w:r>
+      <w:r/>
+    </w:p>
+    <w:p>
+      <w:pPr>
+        <w:pStyle w:val="33"/>
+        <w:pBdr/>
+        <w:spacing/>
+        <w:ind/>
+        <w:rPr/>
+      </w:pPr>
+      <w:r>
+        <w:t xml:space="preserve">        return newNode;</w:t>
+      </w:r>
+      <w:r/>
+    </w:p>
+    <w:p>
+      <w:pPr>
+        <w:pStyle w:val="33"/>
+        <w:pBdr/>
+        <w:spacing/>
+        <w:ind/>
+        <w:rPr/>
+      </w:pPr>
+      <w:r>
+        <w:t xml:space="preserve">    }</w:t>
+      </w:r>
+      <w:r/>
+    </w:p>
+    <w:p>
+      <w:pPr>
+        <w:pStyle w:val="33"/>
+        <w:pBdr/>
+        <w:spacing/>
+        <w:ind/>
+        <w:rPr/>
+      </w:pPr>
+      <w:r>
+        <w:t xml:space="preserve">    </w:t>
+      </w:r>
+      <w:r/>
+    </w:p>
+    <w:p>
+      <w:pPr>
+        <w:pStyle w:val="33"/>
+        <w:pBdr/>
+        <w:spacing/>
+        <w:ind/>
+        <w:rPr/>
+      </w:pPr>
+      <w:r>
+        <w:t xml:space="preserve">    // Zoek het einde</w:t>
+      </w:r>
+      <w:r/>
+    </w:p>
+    <w:p>
+      <w:pPr>
+        <w:pStyle w:val="33"/>
+        <w:pBdr/>
+        <w:spacing/>
+        <w:ind/>
+        <w:rPr/>
+      </w:pPr>
+      <w:r>
+        <w:t xml:space="preserve">    struct node* current = head;</w:t>
+      </w:r>
+      <w:r/>
+    </w:p>
+    <w:p>
+      <w:pPr>
+        <w:pStyle w:val="33"/>
+        <w:pBdr/>
+        <w:spacing/>
+        <w:ind/>
+        <w:rPr/>
+      </w:pPr>
+      <w:r>
+        <w:t xml:space="preserve">    while (current-&gt;next != NULL) {</w:t>
+      </w:r>
+      <w:r/>
+    </w:p>
+    <w:p>
+      <w:pPr>
+        <w:pStyle w:val="33"/>
+        <w:pBdr/>
+        <w:spacing/>
+        <w:ind/>
+        <w:rPr/>
+      </w:pPr>
+      <w:r>
+        <w:t xml:space="preserve">        current = current-&gt;next;</w:t>
+      </w:r>
+      <w:r/>
+    </w:p>
+    <w:p>
+      <w:pPr>
+        <w:pStyle w:val="33"/>
+        <w:pBdr/>
+        <w:spacing/>
+        <w:ind/>
+        <w:rPr/>
+      </w:pPr>
+      <w:r>
+        <w:t xml:space="preserve">    }</w:t>
+      </w:r>
+      <w:r/>
+    </w:p>
+    <w:p>
+      <w:pPr>
+        <w:pStyle w:val="33"/>
+        <w:pBdr/>
+        <w:spacing/>
+        <w:ind/>
+        <w:rPr/>
+      </w:pPr>
+      <w:r>
+        <w:t xml:space="preserve">    </w:t>
+      </w:r>
+      <w:r/>
+    </w:p>
+    <w:p>
+      <w:pPr>
+        <w:pStyle w:val="33"/>
+        <w:pBdr/>
+        <w:spacing/>
+        <w:ind/>
+        <w:rPr/>
+      </w:pPr>
+      <w:r>
+        <w:t xml:space="preserve">    // Voeg toe aan het einde</w:t>
+      </w:r>
+      <w:r/>
+    </w:p>
+    <w:p>
+      <w:pPr>
+        <w:pStyle w:val="33"/>
+        <w:pBdr/>
+        <w:spacing/>
+        <w:ind/>
+        <w:rPr/>
+      </w:pPr>
+      <w:r>
+        <w:t xml:space="preserve">    current-&gt;next = newNode;</w:t>
+      </w:r>
+      <w:r/>
+    </w:p>
+    <w:p>
+      <w:pPr>
+        <w:pStyle w:val="33"/>
+        <w:pBdr/>
+        <w:spacing/>
+        <w:ind/>
+        <w:rPr/>
+      </w:pPr>
+      <w:r>
+        <w:t xml:space="preserve">    printf("Getal %d ingevoegd aan het einde.\n", data);</w:t>
+      </w:r>
+      <w:r/>
+    </w:p>
+    <w:p>
+      <w:pPr>
+        <w:pStyle w:val="33"/>
+        <w:pBdr/>
+        <w:spacing/>
+        <w:ind/>
+        <w:rPr/>
+      </w:pPr>
+      <w:r>
+        <w:t xml:space="preserve">    </w:t>
+      </w:r>
+      <w:r/>
+    </w:p>
+    <w:p>
+      <w:pPr>
+        <w:pStyle w:val="33"/>
+        <w:pBdr/>
+        <w:spacing/>
+        <w:ind/>
+        <w:rPr/>
+      </w:pPr>
+      <w:r>
+        <w:t xml:space="preserve">    return head;</w:t>
+      </w:r>
+      <w:r/>
+    </w:p>
+    <w:p>
+      <w:pPr>
+        <w:pStyle w:val="33"/>
+        <w:pBdr/>
+        <w:spacing/>
+        <w:ind/>
+        <w:rPr/>
+      </w:pPr>
+      <w:r>
+        <w:t xml:space="preserve">}</w:t>
+      </w:r>
+      <w:r/>
+    </w:p>
+    <w:p>
+      <w:pPr>
+        <w:pStyle w:val="33"/>
+        <w:pBdr/>
+        <w:spacing/>
+        <w:ind/>
+        <w:rPr/>
+      </w:pPr>
+      <w:r/>
+      <w:r/>
+    </w:p>
+    <w:p>
+      <w:pPr>
+        <w:pStyle w:val="33"/>
+        <w:pBdr/>
+        <w:spacing/>
+        <w:ind/>
+        <w:rPr/>
+      </w:pPr>
+      <w:r>
+        <w:t xml:space="preserve">// ========== FUNCTIE g) ==========</w:t>
+      </w:r>
+      <w:r/>
+    </w:p>
+    <w:p>
+      <w:pPr>
+        <w:pStyle w:val="33"/>
+        <w:pBdr/>
+        <w:spacing/>
+        <w:ind/>
+        <w:rPr/>
+      </w:pPr>
+      <w:r>
+        <w:t xml:space="preserve">// Verwijder een getal van de eerste plek</w:t>
+      </w:r>
+      <w:r/>
+    </w:p>
+    <w:p>
+      <w:pPr>
+        <w:pStyle w:val="33"/>
+        <w:pBdr/>
+        <w:spacing/>
+        <w:ind/>
+        <w:rPr/>
+      </w:pPr>
+      <w:r>
+        <w:t xml:space="preserve">struct node* deleteFromStart(struct node* head) {</w:t>
+      </w:r>
+      <w:r/>
+    </w:p>
+    <w:p>
+      <w:pPr>
+        <w:pStyle w:val="33"/>
+        <w:pBdr/>
+        <w:spacing/>
+        <w:ind/>
+        <w:rPr/>
+      </w:pPr>
+      <w:r>
+        <w:t xml:space="preserve">    if (head == NULL) {</w:t>
+      </w:r>
+      <w:r/>
+    </w:p>
+    <w:p>
+      <w:pPr>
+        <w:pStyle w:val="33"/>
+        <w:pBdr/>
+        <w:spacing/>
+        <w:ind/>
+        <w:rPr/>
+      </w:pPr>
+      <w:r>
+        <w:t xml:space="preserve">        printf("Linked list is leeg!\n");</w:t>
+      </w:r>
+      <w:r/>
+    </w:p>
+    <w:p>
+      <w:pPr>
+        <w:pStyle w:val="33"/>
+        <w:pBdr/>
+        <w:spacing/>
+        <w:ind/>
+        <w:rPr/>
+      </w:pPr>
+      <w:r>
+        <w:t xml:space="preserve">        return NULL;</w:t>
+      </w:r>
+      <w:r/>
+    </w:p>
+    <w:p>
+      <w:pPr>
+        <w:pStyle w:val="33"/>
+        <w:pBdr/>
+        <w:spacing/>
+        <w:ind/>
+        <w:rPr/>
+      </w:pPr>
+      <w:r>
+        <w:t xml:space="preserve">    }</w:t>
+      </w:r>
+      <w:r/>
+    </w:p>
+    <w:p>
+      <w:pPr>
+        <w:pStyle w:val="33"/>
+        <w:pBdr/>
+        <w:spacing/>
+        <w:ind/>
+        <w:rPr/>
+      </w:pPr>
+      <w:r>
+        <w:t xml:space="preserve">    </w:t>
+      </w:r>
+      <w:r/>
+    </w:p>
+    <w:p>
+      <w:pPr>
+        <w:pStyle w:val="33"/>
+        <w:pBdr/>
+        <w:spacing/>
+        <w:ind/>
+        <w:rPr/>
+      </w:pPr>
+      <w:r>
+        <w:t xml:space="preserve">    struct node* temp = head;</w:t>
+      </w:r>
+      <w:r/>
+    </w:p>
+    <w:p>
+      <w:pPr>
+        <w:pStyle w:val="33"/>
+        <w:pBdr/>
+        <w:spacing/>
+        <w:ind/>
+        <w:rPr/>
+      </w:pPr>
+      <w:r>
+        <w:t xml:space="preserve">    printf("Getal %d verwijderd van het begin.\n", temp-&gt;data);</w:t>
+      </w:r>
+      <w:r/>
+    </w:p>
+    <w:p>
+      <w:pPr>
+        <w:pStyle w:val="33"/>
+        <w:pBdr/>
+        <w:spacing/>
+        <w:ind/>
+        <w:rPr/>
+      </w:pPr>
+      <w:r>
+        <w:t xml:space="preserve">    head = head-&gt;next;</w:t>
+      </w:r>
+      <w:r/>
+    </w:p>
+    <w:p>
+      <w:pPr>
+        <w:pStyle w:val="33"/>
+        <w:pBdr/>
+        <w:spacing/>
+        <w:ind/>
+        <w:rPr/>
+      </w:pPr>
+      <w:r>
+        <w:t xml:space="preserve">    free(temp);</w:t>
+      </w:r>
+      <w:r/>
+    </w:p>
+    <w:p>
+      <w:pPr>
+        <w:pStyle w:val="33"/>
+        <w:pBdr/>
+        <w:spacing/>
+        <w:ind/>
+        <w:rPr/>
+      </w:pPr>
+      <w:r>
+        <w:t xml:space="preserve">    </w:t>
+      </w:r>
+      <w:r/>
+    </w:p>
+    <w:p>
+      <w:pPr>
+        <w:pStyle w:val="33"/>
+        <w:pBdr/>
+        <w:spacing/>
+        <w:ind/>
+        <w:rPr/>
+      </w:pPr>
+      <w:r>
+        <w:t xml:space="preserve">    return head;</w:t>
+      </w:r>
+      <w:r/>
+    </w:p>
+    <w:p>
+      <w:pPr>
+        <w:pStyle w:val="33"/>
+        <w:pBdr/>
+        <w:spacing/>
+        <w:ind/>
+        <w:rPr/>
+      </w:pPr>
+      <w:r>
+        <w:t xml:space="preserve">}</w:t>
+      </w:r>
+      <w:r/>
+    </w:p>
+    <w:p>
+      <w:pPr>
+        <w:pStyle w:val="33"/>
+        <w:pBdr/>
+        <w:spacing/>
+        <w:ind/>
+        <w:rPr/>
+      </w:pPr>
+      <w:r/>
+      <w:r/>
+    </w:p>
+    <w:p>
+      <w:pPr>
+        <w:pStyle w:val="33"/>
+        <w:pBdr/>
+        <w:spacing/>
+        <w:ind/>
+        <w:rPr/>
+      </w:pPr>
+      <w:r>
+        <w:t xml:space="preserve">// Hulpfunctie: geheugen vrijgeven</w:t>
+      </w:r>
+      <w:r/>
+    </w:p>
+    <w:p>
+      <w:pPr>
+        <w:pStyle w:val="33"/>
+        <w:pBdr/>
+        <w:spacing/>
+        <w:ind/>
+        <w:rPr/>
+      </w:pPr>
+      <w:r>
+        <w:t xml:space="preserve">void freeLinkedList(struct node* head) {</w:t>
+      </w:r>
+      <w:r/>
+    </w:p>
+    <w:p>
+      <w:pPr>
+        <w:pStyle w:val="33"/>
+        <w:pBdr/>
+        <w:spacing/>
+        <w:ind/>
+        <w:rPr/>
+      </w:pPr>
+      <w:r>
+        <w:t xml:space="preserve">    struct node* current = head;</w:t>
+      </w:r>
+      <w:r/>
+    </w:p>
+    <w:p>
+      <w:pPr>
+        <w:pStyle w:val="33"/>
+        <w:pBdr/>
+        <w:spacing/>
+        <w:ind/>
+        <w:rPr/>
+      </w:pPr>
+      <w:r>
+        <w:t xml:space="preserve">    while (current != NULL) {</w:t>
+      </w:r>
+      <w:r/>
+    </w:p>
+    <w:p>
+      <w:pPr>
+        <w:pStyle w:val="33"/>
+        <w:pBdr/>
+        <w:spacing/>
+        <w:ind/>
+        <w:rPr/>
+      </w:pPr>
+      <w:r>
+        <w:t xml:space="preserve">        struct node* temp = current;</w:t>
+      </w:r>
+      <w:r/>
+    </w:p>
+    <w:p>
+      <w:pPr>
+        <w:pStyle w:val="33"/>
+        <w:pBdr/>
+        <w:spacing/>
+        <w:ind/>
+        <w:rPr/>
+      </w:pPr>
+      <w:r>
+        <w:t xml:space="preserve">        current = current-&gt;next;</w:t>
+      </w:r>
+      <w:r/>
+    </w:p>
+    <w:p>
+      <w:pPr>
+        <w:pStyle w:val="33"/>
+        <w:pBdr/>
+        <w:spacing/>
+        <w:ind/>
+        <w:rPr/>
+      </w:pPr>
+      <w:r>
+        <w:t xml:space="preserve">        free(temp);</w:t>
+      </w:r>
+      <w:r/>
+    </w:p>
+    <w:p>
+      <w:pPr>
+        <w:pStyle w:val="33"/>
+        <w:pBdr/>
+        <w:spacing/>
+        <w:ind/>
+        <w:rPr/>
+      </w:pPr>
+      <w:r>
+        <w:t xml:space="preserve">    }</w:t>
+      </w:r>
+      <w:r/>
+    </w:p>
+    <w:p>
+      <w:pPr>
+        <w:pStyle w:val="33"/>
+        <w:pBdr/>
+        <w:spacing/>
+        <w:ind/>
+        <w:rPr/>
+      </w:pPr>
+      <w:r>
+        <w:t xml:space="preserve">}</w:t>
+      </w:r>
+      <w:r/>
+    </w:p>
+    <w:p>
+      <w:pPr>
+        <w:pStyle w:val="33"/>
+        <w:pBdr/>
+        <w:spacing/>
+        <w:ind/>
+        <w:rPr/>
+      </w:pPr>
+      <w:r/>
+      <w:r/>
+    </w:p>
+    <w:p>
+      <w:pPr>
+        <w:pStyle w:val="33"/>
+        <w:pBdr/>
+        <w:spacing/>
+        <w:ind/>
+        <w:rPr/>
+      </w:pPr>
+      <w:r>
+        <w:t xml:space="preserve">// ========== MAIN ==========</w:t>
+      </w:r>
+      <w:r/>
+    </w:p>
+    <w:p>
+      <w:pPr>
+        <w:pStyle w:val="33"/>
+        <w:pBdr/>
+        <w:spacing/>
+        <w:ind/>
+        <w:rPr/>
+      </w:pPr>
+      <w:r>
+        <w:t xml:space="preserve">int main(void) {</w:t>
+      </w:r>
+      <w:r/>
+    </w:p>
+    <w:p>
+      <w:pPr>
+        <w:pStyle w:val="33"/>
+        <w:pBdr/>
+        <w:spacing/>
+        <w:ind/>
+        <w:rPr/>
+      </w:pPr>
+      <w:r>
+        <w:t xml:space="preserve">    printf("=== OPDRACHT 2: LINKED LISTS ===\n\n");</w:t>
+      </w:r>
+      <w:r/>
+    </w:p>
+    <w:p>
+      <w:pPr>
+        <w:pStyle w:val="33"/>
+        <w:pBdr/>
+        <w:spacing/>
+        <w:ind/>
+        <w:rPr/>
+      </w:pPr>
+      <w:r>
+        <w:t xml:space="preserve">    </w:t>
+      </w:r>
+      <w:r/>
+    </w:p>
+    <w:p>
+      <w:pPr>
+        <w:pStyle w:val="33"/>
+        <w:pBdr/>
+        <w:spacing/>
+        <w:ind/>
+        <w:rPr/>
+      </w:pPr>
+      <w:r>
+        <w:t xml:space="preserve">    // Test array</w:t>
+      </w:r>
+      <w:r/>
+    </w:p>
+    <w:p>
+      <w:pPr>
+        <w:pStyle w:val="33"/>
+        <w:pBdr/>
+        <w:spacing/>
+        <w:ind/>
+        <w:rPr/>
+      </w:pPr>
+      <w:r>
+        <w:t xml:space="preserve">    int array[] = {10, 20, -5, 30, -15, 40, 50};</w:t>
+      </w:r>
+      <w:r/>
+    </w:p>
+    <w:p>
+      <w:pPr>
+        <w:pStyle w:val="33"/>
+        <w:pBdr/>
+        <w:spacing/>
+        <w:ind/>
+        <w:rPr/>
+      </w:pPr>
+      <w:r>
+        <w:t xml:space="preserve">    int size = 7;</w:t>
+      </w:r>
+      <w:r/>
+    </w:p>
+    <w:p>
+      <w:pPr>
+        <w:pStyle w:val="33"/>
+        <w:pBdr/>
+        <w:spacing/>
+        <w:ind/>
+        <w:rPr/>
+      </w:pPr>
+      <w:r>
+        <w:t xml:space="preserve">    </w:t>
+      </w:r>
+      <w:r/>
+    </w:p>
+    <w:p>
+      <w:pPr>
+        <w:pStyle w:val="33"/>
+        <w:pBdr/>
+        <w:spacing/>
+        <w:ind/>
+        <w:rPr/>
+      </w:pPr>
+      <w:r>
+        <w:t xml:space="preserve">    printf("--- a) Array naar Linked List ---\n");</w:t>
+      </w:r>
+      <w:r/>
+    </w:p>
+    <w:p>
+      <w:pPr>
+        <w:pStyle w:val="33"/>
+        <w:pBdr/>
+        <w:spacing/>
+        <w:ind/>
+        <w:rPr/>
+      </w:pPr>
+      <w:r>
+        <w:t xml:space="preserve">    struct node* list = arrayToLinkedList(array, size);</w:t>
+      </w:r>
+      <w:r/>
+    </w:p>
+    <w:p>
+      <w:pPr>
+        <w:pStyle w:val="33"/>
+        <w:pBdr/>
+        <w:spacing/>
+        <w:ind/>
+        <w:rPr/>
+      </w:pPr>
+      <w:r>
+        <w:t xml:space="preserve">    printLinkedList(list);</w:t>
+      </w:r>
+      <w:r/>
+    </w:p>
+    <w:p>
+      <w:pPr>
+        <w:pStyle w:val="33"/>
+        <w:pBdr/>
+        <w:spacing/>
+        <w:ind/>
+        <w:rPr/>
+      </w:pPr>
+      <w:r>
+        <w:t xml:space="preserve">    printf("\n");</w:t>
+      </w:r>
+      <w:r/>
+    </w:p>
+    <w:p>
+      <w:pPr>
+        <w:pStyle w:val="33"/>
+        <w:pBdr/>
+        <w:spacing/>
+        <w:ind/>
+        <w:rPr/>
+      </w:pPr>
+      <w:r>
+        <w:t xml:space="preserve">    </w:t>
+      </w:r>
+      <w:r/>
+    </w:p>
+    <w:p>
+      <w:pPr>
+        <w:pStyle w:val="33"/>
+        <w:pBdr/>
+        <w:spacing/>
+        <w:ind/>
+        <w:rPr/>
+      </w:pPr>
+      <w:r>
+        <w:t xml:space="preserve">    // ========== FUNCTIE b) TEST ==========</w:t>
+      </w:r>
+      <w:r/>
+    </w:p>
+    <w:p>
+      <w:pPr>
+        <w:pStyle w:val="33"/>
+        <w:pBdr/>
+        <w:spacing/>
+        <w:ind/>
+        <w:rPr/>
+      </w:pPr>
+      <w:r>
+        <w:t xml:space="preserve">    printf("--- b) Node verwijderen op positie 3 ---\n");</w:t>
+      </w:r>
+      <w:r/>
+    </w:p>
+    <w:p>
+      <w:pPr>
+        <w:pStyle w:val="33"/>
+        <w:pBdr/>
+        <w:spacing/>
+        <w:ind/>
+        <w:rPr/>
+      </w:pPr>
+      <w:r>
+        <w:t xml:space="preserve">    list = deleteNodeByPosition(list, 3);</w:t>
+      </w:r>
+      <w:r/>
+    </w:p>
+    <w:p>
+      <w:pPr>
+        <w:pStyle w:val="33"/>
+        <w:pBdr/>
+        <w:spacing/>
+        <w:ind/>
+        <w:rPr/>
+      </w:pPr>
+      <w:r>
+        <w:t xml:space="preserve">    printLinkedList(list);</w:t>
+      </w:r>
+      <w:r/>
+    </w:p>
+    <w:p>
+      <w:pPr>
+        <w:pStyle w:val="33"/>
+        <w:pBdr/>
+        <w:spacing/>
+        <w:ind/>
+        <w:rPr/>
+      </w:pPr>
+      <w:r>
+        <w:t xml:space="preserve">    printf("\n");</w:t>
+      </w:r>
+      <w:r/>
+    </w:p>
+    <w:p>
+      <w:pPr>
+        <w:pStyle w:val="33"/>
+        <w:pBdr/>
+        <w:spacing/>
+        <w:ind/>
+        <w:rPr/>
+      </w:pPr>
+      <w:r>
+        <w:t xml:space="preserve">    </w:t>
+      </w:r>
+      <w:r/>
+    </w:p>
+    <w:p>
+      <w:pPr>
+        <w:pStyle w:val="33"/>
+        <w:pBdr/>
+        <w:spacing/>
+        <w:ind/>
+        <w:rPr/>
+      </w:pPr>
+      <w:r>
+        <w:t xml:space="preserve">    // ========== FUNCTIE c) TEST ==========</w:t>
+      </w:r>
+      <w:r/>
+    </w:p>
+    <w:p>
+      <w:pPr>
+        <w:pStyle w:val="33"/>
+        <w:pBdr/>
+        <w:spacing/>
+        <w:ind/>
+        <w:rPr/>
+      </w:pPr>
+      <w:r>
+        <w:t xml:space="preserve">    printf("--- c) Eerste negatieve getal verwijderen ---\n");</w:t>
+      </w:r>
+      <w:r/>
+    </w:p>
+    <w:p>
+      <w:pPr>
+        <w:pStyle w:val="33"/>
+        <w:pBdr/>
+        <w:spacing/>
+        <w:ind/>
+        <w:rPr/>
+      </w:pPr>
+      <w:r>
+        <w:t xml:space="preserve">    list = deleteFirstNegative(list);</w:t>
+      </w:r>
+      <w:r/>
+    </w:p>
+    <w:p>
+      <w:pPr>
+        <w:pStyle w:val="33"/>
+        <w:pBdr/>
+        <w:spacing/>
+        <w:ind/>
+        <w:rPr/>
+      </w:pPr>
+      <w:r>
+        <w:t xml:space="preserve">    printLinkedList(list);</w:t>
+      </w:r>
+      <w:r/>
+    </w:p>
+    <w:p>
+      <w:pPr>
+        <w:pStyle w:val="33"/>
+        <w:pBdr/>
+        <w:spacing/>
+        <w:ind/>
+        <w:rPr/>
+      </w:pPr>
+      <w:r>
+        <w:t xml:space="preserve">    printf("\n");</w:t>
+      </w:r>
+      <w:r/>
+    </w:p>
+    <w:p>
+      <w:pPr>
+        <w:pStyle w:val="33"/>
+        <w:pBdr/>
+        <w:spacing/>
+        <w:ind/>
+        <w:rPr/>
+      </w:pPr>
+      <w:r>
+        <w:t xml:space="preserve">    </w:t>
+      </w:r>
+      <w:r/>
+    </w:p>
+    <w:p>
+      <w:pPr>
+        <w:pStyle w:val="33"/>
+        <w:pBdr/>
+        <w:spacing/>
+        <w:ind/>
+        <w:rPr/>
+      </w:pPr>
+      <w:r>
+        <w:t xml:space="preserve">    // ========== FUNCTIE d) TEST ==========</w:t>
+      </w:r>
+      <w:r/>
+    </w:p>
+    <w:p>
+      <w:pPr>
+        <w:pStyle w:val="33"/>
+        <w:pBdr/>
+        <w:spacing/>
+        <w:ind/>
+        <w:rPr/>
+      </w:pPr>
+      <w:r>
+        <w:t xml:space="preserve">    printf("--- d) Alle negatieve getallen verwijderen ---\n");</w:t>
+      </w:r>
+      <w:r/>
+    </w:p>
+    <w:p>
+      <w:pPr>
+        <w:pStyle w:val="33"/>
+        <w:pBdr/>
+        <w:spacing/>
+        <w:ind/>
+        <w:rPr/>
+      </w:pPr>
+      <w:r>
+        <w:t xml:space="preserve">    list = deleteAllNegative(list);</w:t>
+      </w:r>
+      <w:r/>
+    </w:p>
+    <w:p>
+      <w:pPr>
+        <w:pStyle w:val="33"/>
+        <w:pBdr/>
+        <w:spacing/>
+        <w:ind/>
+        <w:rPr/>
+      </w:pPr>
+      <w:r>
+        <w:t xml:space="preserve">    printLinkedList(list);</w:t>
+      </w:r>
+      <w:r/>
+    </w:p>
+    <w:p>
+      <w:pPr>
+        <w:pStyle w:val="33"/>
+        <w:pBdr/>
+        <w:spacing/>
+        <w:ind/>
+        <w:rPr/>
+      </w:pPr>
+      <w:r>
+        <w:t xml:space="preserve">    printf("\n");</w:t>
+      </w:r>
+      <w:r/>
+    </w:p>
+    <w:p>
+      <w:pPr>
+        <w:pStyle w:val="33"/>
+        <w:pBdr/>
+        <w:spacing/>
+        <w:ind/>
+        <w:rPr/>
+      </w:pPr>
+      <w:r>
+        <w:t xml:space="preserve">    </w:t>
+      </w:r>
+      <w:r/>
+    </w:p>
+    <w:p>
+      <w:pPr>
+        <w:pStyle w:val="33"/>
+        <w:pBdr/>
+        <w:spacing/>
+        <w:ind/>
+        <w:rPr/>
+      </w:pPr>
+      <w:r>
+        <w:t xml:space="preserve">    // ========== FUNCTIE e) TEST ==========</w:t>
+      </w:r>
+      <w:r/>
+    </w:p>
+    <w:p>
+      <w:pPr>
+        <w:pStyle w:val="33"/>
+        <w:pBdr/>
+        <w:spacing/>
+        <w:ind/>
+        <w:rPr/>
+      </w:pPr>
+      <w:r>
+        <w:t xml:space="preserve">    printf("--- e) Getal toevoegen op positie 2 ---\n");</w:t>
+      </w:r>
+      <w:r/>
+    </w:p>
+    <w:p>
+      <w:pPr>
+        <w:pStyle w:val="33"/>
+        <w:pBdr/>
+        <w:spacing/>
+        <w:ind/>
+        <w:rPr/>
+      </w:pPr>
+      <w:r>
+        <w:t xml:space="preserve">    list = insertAtPosition(list, 25, 2);</w:t>
+      </w:r>
+      <w:r/>
+    </w:p>
+    <w:p>
+      <w:pPr>
+        <w:pStyle w:val="33"/>
+        <w:pBdr/>
+        <w:spacing/>
+        <w:ind/>
+        <w:rPr/>
+      </w:pPr>
+      <w:r>
+        <w:t xml:space="preserve">    printLinkedList(list);</w:t>
+      </w:r>
+      <w:r/>
+    </w:p>
+    <w:p>
+      <w:pPr>
+        <w:pStyle w:val="33"/>
+        <w:pBdr/>
+        <w:spacing/>
+        <w:ind/>
+        <w:rPr/>
+      </w:pPr>
+      <w:r>
+        <w:t xml:space="preserve">    printf("\n");</w:t>
+      </w:r>
+      <w:r/>
+    </w:p>
+    <w:p>
+      <w:pPr>
+        <w:pStyle w:val="33"/>
+        <w:pBdr/>
+        <w:spacing/>
+        <w:ind/>
+        <w:rPr/>
+      </w:pPr>
+      <w:r>
+        <w:t xml:space="preserve">    </w:t>
+      </w:r>
+      <w:r/>
+    </w:p>
+    <w:p>
+      <w:pPr>
+        <w:pStyle w:val="33"/>
+        <w:pBdr/>
+        <w:spacing/>
+        <w:ind/>
+        <w:rPr/>
+      </w:pPr>
+      <w:r>
+        <w:t xml:space="preserve">    // ========== FUNCTIE f) TEST ==========</w:t>
+      </w:r>
+      <w:r/>
+    </w:p>
+    <w:p>
+      <w:pPr>
+        <w:pStyle w:val="33"/>
+        <w:pBdr/>
+        <w:spacing/>
+        <w:ind/>
+        <w:rPr/>
+      </w:pPr>
+      <w:r>
+        <w:t xml:space="preserve">    printf("--- f) Getal toevoegen aan het einde ---\n");</w:t>
+      </w:r>
+      <w:r/>
+    </w:p>
+    <w:p>
+      <w:pPr>
+        <w:pStyle w:val="33"/>
+        <w:pBdr/>
+        <w:spacing/>
+        <w:ind/>
+        <w:rPr/>
+      </w:pPr>
+      <w:r>
+        <w:t xml:space="preserve">    list = insertAtEnd(list, 100);</w:t>
+      </w:r>
+      <w:r/>
+    </w:p>
+    <w:p>
+      <w:pPr>
+        <w:pStyle w:val="33"/>
+        <w:pBdr/>
+        <w:spacing/>
+        <w:ind/>
+        <w:rPr/>
+      </w:pPr>
+      <w:r>
+        <w:t xml:space="preserve">    printLinkedList(list);</w:t>
+      </w:r>
+      <w:r/>
+    </w:p>
+    <w:p>
+      <w:pPr>
+        <w:pStyle w:val="33"/>
+        <w:pBdr/>
+        <w:spacing/>
+        <w:ind/>
+        <w:rPr/>
+      </w:pPr>
+      <w:r>
+        <w:t xml:space="preserve">    printf("\n");</w:t>
+      </w:r>
+      <w:r/>
+    </w:p>
+    <w:p>
+      <w:pPr>
+        <w:pStyle w:val="33"/>
+        <w:pBdr/>
+        <w:spacing/>
+        <w:ind/>
+        <w:rPr/>
+      </w:pPr>
+      <w:r>
+        <w:t xml:space="preserve">    </w:t>
+      </w:r>
+      <w:r/>
+    </w:p>
+    <w:p>
+      <w:pPr>
+        <w:pStyle w:val="33"/>
+        <w:pBdr/>
+        <w:spacing/>
+        <w:ind/>
+        <w:rPr/>
+      </w:pPr>
+      <w:r>
+        <w:t xml:space="preserve">    // ========== FUNCTIE g) &amp; h) QUEUE DEMONSTRATIE ==========</w:t>
+      </w:r>
+      <w:r/>
+    </w:p>
+    <w:p>
+      <w:pPr>
+        <w:pStyle w:val="33"/>
+        <w:pBdr/>
+        <w:spacing/>
+        <w:ind/>
+        <w:rPr/>
+      </w:pPr>
+      <w:r>
+        <w:t xml:space="preserve">    printf("--- h) QUEUE DEMONSTRATIE (FIFO: First In, First Out) ---\n");</w:t>
+      </w:r>
+      <w:r/>
+    </w:p>
+    <w:p>
+      <w:pPr>
+        <w:pStyle w:val="33"/>
+        <w:pBdr/>
+        <w:spacing/>
+        <w:ind/>
+        <w:rPr/>
+      </w:pPr>
+      <w:r>
+        <w:t xml:space="preserve">    struct node* queue = NULL;</w:t>
+      </w:r>
+      <w:r/>
+    </w:p>
+    <w:p>
+      <w:pPr>
+        <w:pStyle w:val="33"/>
+        <w:pBdr/>
+        <w:spacing/>
+        <w:ind/>
+        <w:rPr/>
+      </w:pPr>
+      <w:r>
+        <w:t xml:space="preserve">    </w:t>
+      </w:r>
+      <w:r/>
+    </w:p>
+    <w:p>
+      <w:pPr>
+        <w:pStyle w:val="33"/>
+        <w:pBdr/>
+        <w:spacing/>
+        <w:ind/>
+        <w:rPr/>
+      </w:pPr>
+      <w:r>
+        <w:t xml:space="preserve">    printf("Voeg getallen toe aan queue (insertAtEnd):\n");</w:t>
+      </w:r>
+      <w:r/>
+    </w:p>
+    <w:p>
+      <w:pPr>
+        <w:pStyle w:val="33"/>
+        <w:pBdr/>
+        <w:spacing/>
+        <w:ind/>
+        <w:rPr/>
+      </w:pPr>
+      <w:r>
+        <w:t xml:space="preserve">    queue = insertAtEnd(queue, 1);</w:t>
+      </w:r>
+      <w:r/>
+    </w:p>
+    <w:p>
+      <w:pPr>
+        <w:pStyle w:val="33"/>
+        <w:pBdr/>
+        <w:spacing/>
+        <w:ind/>
+        <w:rPr/>
+      </w:pPr>
+      <w:r>
+        <w:t xml:space="preserve">    queue = insertAtEnd(queue, 2);</w:t>
+      </w:r>
+      <w:r/>
+    </w:p>
+    <w:p>
+      <w:pPr>
+        <w:pStyle w:val="33"/>
+        <w:pBdr/>
+        <w:spacing/>
+        <w:ind/>
+        <w:rPr/>
+      </w:pPr>
+      <w:r>
+        <w:t xml:space="preserve">    queue = insertAtEnd(queue, 3);</w:t>
+      </w:r>
+      <w:r/>
+    </w:p>
+    <w:p>
+      <w:pPr>
+        <w:pStyle w:val="33"/>
+        <w:pBdr/>
+        <w:spacing/>
+        <w:ind/>
+        <w:rPr/>
+      </w:pPr>
+      <w:r>
+        <w:t xml:space="preserve">    printLinkedList(queue);</w:t>
+      </w:r>
+      <w:r/>
+    </w:p>
+    <w:p>
+      <w:pPr>
+        <w:pStyle w:val="33"/>
+        <w:pBdr/>
+        <w:spacing/>
+        <w:ind/>
+        <w:rPr/>
+      </w:pPr>
+      <w:r>
+        <w:t xml:space="preserve">    </w:t>
+      </w:r>
+      <w:r/>
+    </w:p>
+    <w:p>
+      <w:pPr>
+        <w:pStyle w:val="33"/>
+        <w:pBdr/>
+        <w:spacing/>
+        <w:ind/>
+        <w:rPr/>
+      </w:pPr>
+      <w:r>
+        <w:t xml:space="preserve">    printf("\nVerwijder van het begin (deleteFromStart - FIFO):\n");</w:t>
+      </w:r>
+      <w:r/>
+    </w:p>
+    <w:p>
+      <w:pPr>
+        <w:pStyle w:val="33"/>
+        <w:pBdr/>
+        <w:spacing/>
+        <w:ind/>
+        <w:rPr/>
+      </w:pPr>
+      <w:r>
+        <w:t xml:space="preserve">    queue = deleteFromStart(queue);</w:t>
+      </w:r>
+      <w:r/>
+    </w:p>
+    <w:p>
+      <w:pPr>
+        <w:pStyle w:val="33"/>
+        <w:pBdr/>
+        <w:spacing/>
+        <w:ind/>
+        <w:rPr/>
+      </w:pPr>
+      <w:r>
+        <w:t xml:space="preserve">    printLinkedList(queue);</w:t>
+      </w:r>
+      <w:r/>
+    </w:p>
+    <w:p>
+      <w:pPr>
+        <w:pStyle w:val="33"/>
+        <w:pBdr/>
+        <w:spacing/>
+        <w:ind/>
+        <w:rPr/>
+      </w:pPr>
+      <w:r>
+        <w:t xml:space="preserve">    queue = deleteFromStart(queue);</w:t>
+      </w:r>
+      <w:r/>
+    </w:p>
+    <w:p>
+      <w:pPr>
+        <w:pStyle w:val="33"/>
+        <w:pBdr/>
+        <w:spacing/>
+        <w:ind/>
+        <w:rPr/>
+      </w:pPr>
+      <w:r>
+        <w:t xml:space="preserve">    printLinkedList(queue);</w:t>
+      </w:r>
+      <w:r/>
+    </w:p>
+    <w:p>
+      <w:pPr>
+        <w:pStyle w:val="33"/>
+        <w:pBdr/>
+        <w:spacing/>
+        <w:ind/>
+        <w:rPr/>
+      </w:pPr>
+      <w:r>
+        <w:t xml:space="preserve">    queue = deleteFromStart(queue);</w:t>
+      </w:r>
+      <w:r/>
+    </w:p>
+    <w:p>
+      <w:pPr>
+        <w:pStyle w:val="33"/>
+        <w:pBdr/>
+        <w:spacing/>
+        <w:ind/>
+        <w:rPr/>
+      </w:pPr>
+      <w:r>
+        <w:t xml:space="preserve">    printLinkedList(queue);</w:t>
+      </w:r>
+      <w:r/>
+    </w:p>
+    <w:p>
+      <w:pPr>
+        <w:pStyle w:val="33"/>
+        <w:pBdr/>
+        <w:spacing/>
+        <w:ind/>
+        <w:rPr/>
+      </w:pPr>
+      <w:r>
+        <w:t xml:space="preserve">    printf("\n");</w:t>
+      </w:r>
+      <w:r/>
+    </w:p>
+    <w:p>
+      <w:pPr>
+        <w:pStyle w:val="33"/>
+        <w:pBdr/>
+        <w:spacing/>
+        <w:ind/>
+        <w:rPr/>
+      </w:pPr>
+      <w:r>
+        <w:t xml:space="preserve">    </w:t>
+      </w:r>
+      <w:r/>
+    </w:p>
+    <w:p>
+      <w:pPr>
+        <w:pStyle w:val="33"/>
+        <w:pBdr/>
+        <w:spacing/>
+        <w:ind/>
+        <w:rPr/>
+      </w:pPr>
+      <w:r>
+        <w:t xml:space="preserve">    // ========== FUNCTIE i) STACK VRAAG ==========</w:t>
+      </w:r>
+      <w:r/>
+    </w:p>
+    <w:p>
+      <w:pPr>
+        <w:pStyle w:val="33"/>
+        <w:pBdr/>
+        <w:spacing/>
+        <w:ind/>
+        <w:rPr/>
+      </w:pPr>
+      <w:r>
+        <w:t xml:space="preserve">    printf("--- i) Welke functie is nodig voor een STACK? ---\n");</w:t>
+      </w:r>
+      <w:r/>
+    </w:p>
+    <w:p>
+      <w:pPr>
+        <w:pStyle w:val="33"/>
+        <w:pBdr/>
+        <w:spacing/>
+        <w:ind/>
+        <w:rPr/>
+      </w:pPr>
+      <w:r>
+        <w:t xml:space="preserve">    printf("Voor een STACK (LIFO: Last In, First Out) zou je nodig hebben:\n");</w:t>
+      </w:r>
+      <w:r/>
+    </w:p>
+    <w:p>
+      <w:pPr>
+        <w:pStyle w:val="33"/>
+        <w:pBdr/>
+        <w:spacing/>
+        <w:ind/>
+        <w:rPr/>
+      </w:pPr>
+      <w:r>
+        <w:t xml:space="preserve">    printf("  - insertAtStart() of insertAtBeginning()\n");</w:t>
+      </w:r>
+      <w:r/>
+    </w:p>
+    <w:p>
+      <w:pPr>
+        <w:pStyle w:val="33"/>
+        <w:pBdr/>
+        <w:spacing/>
+        <w:ind/>
+        <w:rPr/>
+      </w:pPr>
+      <w:r>
+        <w:t xml:space="preserve">    printf("     (om toe te voegen aan het BEGIN van de linked list)\n");</w:t>
+      </w:r>
+      <w:r/>
+    </w:p>
+    <w:p>
+      <w:pPr>
+        <w:pStyle w:val="33"/>
+        <w:pBdr/>
+        <w:spacing/>
+        <w:ind/>
+        <w:rPr/>
+      </w:pPr>
+      <w:r>
+        <w:t xml:space="preserve">    printf("\nMet insertAtStart() en deleteFromStart() kun je een STACK maken\n");</w:t>
+      </w:r>
+      <w:r/>
+    </w:p>
+    <w:p>
+      <w:pPr>
+        <w:pStyle w:val="33"/>
+        <w:pBdr/>
+        <w:spacing/>
+        <w:ind/>
+        <w:rPr/>
+      </w:pPr>
+      <w:r>
+        <w:t xml:space="preserve">    printf("omdat getallen LIFO (Last In, First Out) worden verwerkt.\n");</w:t>
+      </w:r>
+      <w:r/>
+    </w:p>
+    <w:p>
+      <w:pPr>
+        <w:pStyle w:val="33"/>
+        <w:pBdr/>
+        <w:spacing/>
+        <w:ind/>
+        <w:rPr/>
+      </w:pPr>
+      <w:r>
+        <w:t xml:space="preserve">    printf("\n");</w:t>
+      </w:r>
+      <w:r/>
+    </w:p>
+    <w:p>
+      <w:pPr>
+        <w:pStyle w:val="33"/>
+        <w:pBdr/>
+        <w:spacing/>
+        <w:ind/>
+        <w:rPr/>
+      </w:pPr>
+      <w:r>
+        <w:t xml:space="preserve">    </w:t>
+      </w:r>
+      <w:r/>
+    </w:p>
+    <w:p>
+      <w:pPr>
+        <w:pStyle w:val="33"/>
+        <w:pBdr/>
+        <w:spacing/>
+        <w:ind/>
+        <w:rPr/>
+      </w:pPr>
+      <w:r>
+        <w:t xml:space="preserve">    // Opruimen</w:t>
+      </w:r>
+      <w:r/>
+    </w:p>
+    <w:p>
+      <w:pPr>
+        <w:pStyle w:val="33"/>
+        <w:pBdr/>
+        <w:spacing/>
+        <w:ind/>
+        <w:rPr/>
+      </w:pPr>
+      <w:r>
+        <w:t xml:space="preserve">    freeLinkedList(list);</w:t>
+      </w:r>
+      <w:r/>
+    </w:p>
+    <w:p>
+      <w:pPr>
+        <w:pStyle w:val="33"/>
+        <w:pBdr/>
+        <w:spacing/>
+        <w:ind/>
+        <w:rPr/>
+      </w:pPr>
+      <w:r>
+        <w:t xml:space="preserve">    freeLinkedList(queue);</w:t>
+      </w:r>
+      <w:r/>
+    </w:p>
+    <w:p>
+      <w:pPr>
+        <w:pStyle w:val="33"/>
+        <w:pBdr/>
+        <w:spacing/>
+        <w:ind/>
+        <w:rPr/>
+      </w:pPr>
+      <w:r>
+        <w:t xml:space="preserve">    </w:t>
+      </w:r>
+      <w:r/>
+    </w:p>
+    <w:p>
+      <w:pPr>
+        <w:pStyle w:val="33"/>
+        <w:pBdr/>
+        <w:spacing/>
+        <w:ind/>
+        <w:rPr/>
+      </w:pPr>
+      <w:r>
+        <w:t xml:space="preserve">    printf("=== Programma beeindigd ===\n");</w:t>
+      </w:r>
+      <w:r/>
+    </w:p>
+    <w:p>
+      <w:pPr>
+        <w:pStyle w:val="33"/>
+        <w:pBdr/>
+        <w:spacing/>
+        <w:ind/>
+        <w:rPr/>
+      </w:pPr>
+      <w:r>
+        <w:t xml:space="preserve">    return 0;</w:t>
+      </w:r>
+      <w:r/>
+    </w:p>
+    <w:p>
+      <w:pPr>
+        <w:pStyle w:val="33"/>
+        <w:pBdr/>
+        <w:spacing/>
+        <w:ind/>
+        <w:rPr/>
+      </w:pPr>
+      <w:r>
+        <w:t xml:space="preserve">}</w:t>
+      </w:r>
+      <w:r/>
       <w:r/>
       <w:r/>
     </w:p>

</xml_diff>